<commit_message>
feat: update profile and project
</commit_message>
<xml_diff>
--- a/public/documents/CV_Patrick_Gonzaga.docx
+++ b/public/documents/CV_Patrick_Gonzaga.docx
@@ -591,6 +591,7 @@
                 </w:tcPr>
                 <w:p>
                   <w:pPr>
+                    <w:jc w:val="both"/>
                     <w:rPr>
                       <w:rFonts w:ascii="Calibri" w:eastAsia="Calibri" w:hAnsi="Calibri" w:cs="Calibri"/>
                       <w:color w:val="2C2C2C"/>
@@ -601,7 +602,23 @@
                       <w:rFonts w:ascii="Calibri" w:eastAsia="Calibri" w:hAnsi="Calibri" w:cs="Calibri"/>
                       <w:color w:val="2C2C2C"/>
                     </w:rPr>
-                    <w:t>Systems-minded Senior Software Engineer with two decades of experience building enterprise software, high-throughput backend services, and automated integration pipelines. Combines a deep foundation in database architecture and enterprise systems with 5+ years of focused C#/.NET, ASP.NET Core, and Azure cloud development. Driven by pinpointing operational gaps, engineering resilient solutions, and delivering clean, maintainable software in production.</w:t>
+                    <w:t xml:space="preserve">Senior Software Engineer with two decades of experience and 5+ years hands-on with C#/.NET, ASP.NET Core, and Azure. Adopted AI-native development early, using Cursor, Claude, and </w:t>
+                  </w:r>
+                  <w:proofErr w:type="spellStart"/>
+                  <w:r>
+                    <w:rPr>
+                      <w:rFonts w:ascii="Calibri" w:eastAsia="Calibri" w:hAnsi="Calibri" w:cs="Calibri"/>
+                      <w:color w:val="2C2C2C"/>
+                    </w:rPr>
+                    <w:t>ChatGPT</w:t>
+                  </w:r>
+                  <w:proofErr w:type="spellEnd"/>
+                  <w:r>
+                    <w:rPr>
+                      <w:rFonts w:ascii="Calibri" w:eastAsia="Calibri" w:hAnsi="Calibri" w:cs="Calibri"/>
+                      <w:color w:val="2C2C2C"/>
+                    </w:rPr>
+                    <w:t xml:space="preserve"> to accelerate delivery, explore solutions, troubleshoot complex problems, and improve code. AI accelerates the work; engineering judgment, validation, and code quality remain non-negotiable.</w:t>
                   </w:r>
                 </w:p>
               </w:tc>
@@ -1203,7 +1220,6 @@
                 <w:rFonts w:ascii="Calibri" w:eastAsia="Calibri" w:hAnsi="Calibri" w:cs="Calibri"/>
                 <w:color w:val="2C2C2C"/>
               </w:rPr>
-              <w:lastRenderedPageBreak/>
               <w:t>• Administered over 100 servers running on physical, VMware, and Hyper-V infrastructure, including in-house and Japan Software databases running on Oracle and MS SQL.</w:t>
             </w:r>
           </w:p>
@@ -1217,6 +1233,7 @@
                 <w:rFonts w:ascii="Calibri" w:eastAsia="Calibri" w:hAnsi="Calibri" w:cs="Calibri"/>
                 <w:color w:val="2C2C2C"/>
               </w:rPr>
+              <w:lastRenderedPageBreak/>
               <w:t>• Developed system integrations between SAP and MES, automating material master registration and production planning processes.</w:t>
             </w:r>
           </w:p>

</xml_diff>

<commit_message>
feat:Update resume and add code quality tools
</commit_message>
<xml_diff>
--- a/public/documents/CV_Patrick_Gonzaga.docx
+++ b/public/documents/CV_Patrick_Gonzaga.docx
@@ -153,28 +153,7 @@
                 <w:rFonts w:ascii="Calibri" w:eastAsia="Calibri" w:hAnsi="Calibri" w:cs="Calibri"/>
                 <w:color w:val="E2E8EE"/>
               </w:rPr>
-              <w:t>+63 9</w:t>
-            </w:r>
-            <w:r>
-              <w:rPr>
-                <w:rFonts w:ascii="Calibri" w:eastAsia="Calibri" w:hAnsi="Calibri" w:cs="Calibri"/>
-                <w:color w:val="E2E8EE"/>
-              </w:rPr>
-              <w:t>29</w:t>
-            </w:r>
-            <w:r>
-              <w:rPr>
-                <w:rFonts w:ascii="Calibri" w:eastAsia="Calibri" w:hAnsi="Calibri" w:cs="Calibri"/>
-                <w:color w:val="E2E8EE"/>
-              </w:rPr>
-              <w:t xml:space="preserve"> </w:t>
-            </w:r>
-            <w:r>
-              <w:rPr>
-                <w:rFonts w:ascii="Calibri" w:eastAsia="Calibri" w:hAnsi="Calibri" w:cs="Calibri"/>
-                <w:color w:val="E2E8EE"/>
-              </w:rPr>
-              <w:t>492 4510</w:t>
+              <w:t>+63 929 492 4510</w:t>
             </w:r>
           </w:p>
           <w:p>
@@ -212,18 +191,7 @@
                 <w:sz w:val="24"/>
                 <w:szCs w:val="24"/>
               </w:rPr>
-              <w:t xml:space="preserve">CORE </w:t>
-            </w:r>
-            <w:r>
-              <w:rPr>
-                <w:rFonts w:ascii="Calibri" w:eastAsia="Calibri" w:hAnsi="Calibri" w:cs="Calibri"/>
-                <w:b/>
-                <w:bCs/>
-                <w:color w:val="45C7B8"/>
-                <w:sz w:val="24"/>
-                <w:szCs w:val="24"/>
-              </w:rPr>
-              <w:t>SKILLS</w:t>
+              <w:t>CORE SKILLS</w:t>
             </w:r>
           </w:p>
           <w:p>
@@ -313,6 +281,32 @@
             </w:pPr>
             <w:r>
               <w:rPr>
+                <w:rFonts w:ascii="Calibri" w:hAnsi="Calibri"/>
+                <w:b/>
+                <w:color w:val="FFFFFF"/>
+                <w:sz w:val="22"/>
+              </w:rPr>
+              <w:t>Code Quality &amp; Security</w:t>
+            </w:r>
+          </w:p>
+          <w:p>
+            <w:pPr>
+              <w:spacing w:after="120"/>
+            </w:pPr>
+            <w:r>
+              <w:rPr>
+                <w:rFonts w:ascii="Calibri" w:hAnsi="Calibri"/>
+                <w:color w:val="E2E8EE"/>
+              </w:rPr>
+              <w:t>SonarQube · Snyk</w:t>
+            </w:r>
+          </w:p>
+          <w:p>
+            <w:pPr>
+              <w:spacing w:before="160" w:after="40"/>
+            </w:pPr>
+            <w:r>
+              <w:rPr>
                 <w:rFonts w:ascii="Calibri" w:eastAsia="Calibri" w:hAnsi="Calibri" w:cs="Calibri"/>
                 <w:b/>
                 <w:bCs/>
@@ -420,14 +414,7 @@
                 <w:rFonts w:ascii="Calibri" w:eastAsia="Calibri" w:hAnsi="Calibri" w:cs="Calibri"/>
                 <w:color w:val="E2E8EE"/>
               </w:rPr>
-              <w:t>Cursor</w:t>
-            </w:r>
-            <w:r>
-              <w:rPr>
-                <w:rFonts w:ascii="Calibri" w:eastAsia="Calibri" w:hAnsi="Calibri" w:cs="Calibri"/>
-                <w:color w:val="E2E8EE"/>
-              </w:rPr>
-              <w:t>, Gemini</w:t>
+              <w:t>Cursor, Gemini</w:t>
             </w:r>
           </w:p>
           <w:p>
@@ -479,29 +466,7 @@
                 <w:sz w:val="22"/>
                 <w:szCs w:val="22"/>
               </w:rPr>
-              <w:t xml:space="preserve">AI </w:t>
-            </w:r>
-            <w:r>
-              <w:rPr>
-                <w:rFonts w:ascii="Calibri" w:eastAsia="Calibri" w:hAnsi="Calibri" w:cs="Calibri"/>
-                <w:b/>
-                <w:bCs/>
-                <w:color w:val="FFFFFF"/>
-                <w:sz w:val="22"/>
-                <w:szCs w:val="22"/>
-              </w:rPr>
-              <w:t xml:space="preserve">Automation </w:t>
-            </w:r>
-            <w:r>
-              <w:rPr>
-                <w:rFonts w:ascii="Calibri" w:eastAsia="Calibri" w:hAnsi="Calibri" w:cs="Calibri"/>
-                <w:b/>
-                <w:bCs/>
-                <w:color w:val="FFFFFF"/>
-                <w:sz w:val="22"/>
-                <w:szCs w:val="22"/>
-              </w:rPr>
-              <w:t>Workflows</w:t>
+              <w:t>AI Automation Workflows</w:t>
             </w:r>
           </w:p>
           <w:p>
@@ -544,18 +509,7 @@
                 <w:sz w:val="24"/>
                 <w:szCs w:val="24"/>
               </w:rPr>
-              <w:t xml:space="preserve">CAREER </w:t>
-            </w:r>
-            <w:r>
-              <w:rPr>
-                <w:rFonts w:ascii="Calibri" w:eastAsia="Calibri" w:hAnsi="Calibri" w:cs="Calibri"/>
-                <w:b/>
-                <w:bCs/>
-                <w:color w:val="24344A"/>
-                <w:sz w:val="24"/>
-                <w:szCs w:val="24"/>
-              </w:rPr>
-              <w:t>PROFILE</w:t>
+              <w:t>CAREER PROFILE</w:t>
             </w:r>
           </w:p>
           <w:tbl>
@@ -602,23 +556,7 @@
                       <w:rFonts w:ascii="Calibri" w:eastAsia="Calibri" w:hAnsi="Calibri" w:cs="Calibri"/>
                       <w:color w:val="2C2C2C"/>
                     </w:rPr>
-                    <w:t xml:space="preserve">Senior Software Engineer with two decades of experience and 5+ years hands-on with C#/.NET, ASP.NET Core, and Azure. Adopted AI-native development early, using Cursor, Claude, and </w:t>
-                  </w:r>
-                  <w:proofErr w:type="spellStart"/>
-                  <w:r>
-                    <w:rPr>
-                      <w:rFonts w:ascii="Calibri" w:eastAsia="Calibri" w:hAnsi="Calibri" w:cs="Calibri"/>
-                      <w:color w:val="2C2C2C"/>
-                    </w:rPr>
-                    <w:t>ChatGPT</w:t>
-                  </w:r>
-                  <w:proofErr w:type="spellEnd"/>
-                  <w:r>
-                    <w:rPr>
-                      <w:rFonts w:ascii="Calibri" w:eastAsia="Calibri" w:hAnsi="Calibri" w:cs="Calibri"/>
-                      <w:color w:val="2C2C2C"/>
-                    </w:rPr>
-                    <w:t xml:space="preserve"> to accelerate delivery, explore solutions, troubleshoot complex problems, and improve code. AI accelerates the work; engineering judgment, validation, and code quality remain non-negotiable.</w:t>
+                    <w:t>Senior Software Engineer with 2 decades of software development experience, including 5+ years specializing in C#/.NET and Azure. Hands-on experience designing and delivering cloud-native, event-driven platforms using Azure PaaS, SQL, CI/CD, and infrastructure as code. Strong across the full lifecycle, from architecture and development to production support and continuous improvement.</w:t>
                   </w:r>
                 </w:p>
               </w:tc>
@@ -640,29 +578,7 @@
                 <w:sz w:val="24"/>
                 <w:szCs w:val="24"/>
               </w:rPr>
-              <w:t xml:space="preserve">PROFESSIONAL </w:t>
-            </w:r>
-            <w:r>
-              <w:rPr>
-                <w:rFonts w:ascii="Calibri" w:eastAsia="Calibri" w:hAnsi="Calibri" w:cs="Calibri"/>
-                <w:b/>
-                <w:bCs/>
-                <w:color w:val="24344A"/>
-                <w:sz w:val="24"/>
-                <w:szCs w:val="24"/>
-              </w:rPr>
-              <w:t>EXPERIENCE</w:t>
-            </w:r>
-            <w:r>
-              <w:rPr>
-                <w:rFonts w:ascii="Calibri" w:eastAsia="Calibri" w:hAnsi="Calibri" w:cs="Calibri"/>
-                <w:b/>
-                <w:bCs/>
-                <w:color w:val="24344A"/>
-                <w:sz w:val="24"/>
-                <w:szCs w:val="24"/>
-              </w:rPr>
-              <w:t>S</w:t>
+              <w:t>PROFESSIONAL EXPERIENCES</w:t>
             </w:r>
           </w:p>
           <w:p>
@@ -689,12 +605,6 @@
                 <w:color w:val="6B7280"/>
               </w:rPr>
               <w:tab/>
-            </w:r>
-            <w:r>
-              <w:rPr>
-                <w:rFonts w:ascii="Calibri" w:eastAsia="Calibri" w:hAnsi="Calibri" w:cs="Calibri"/>
-                <w:color w:val="6B7280"/>
-              </w:rPr>
               <w:t>2023 - 2026</w:t>
             </w:r>
             <w:r>
@@ -713,18 +623,7 @@
                 <w:sz w:val="22"/>
                 <w:szCs w:val="22"/>
               </w:rPr>
-              <w:t xml:space="preserve">Client: </w:t>
-            </w:r>
-            <w:r>
-              <w:rPr>
-                <w:rFonts w:ascii="Calibri" w:eastAsia="Calibri" w:hAnsi="Calibri" w:cs="Calibri"/>
-                <w:b/>
-                <w:bCs/>
-                <w:color w:val="1E7F76"/>
-                <w:sz w:val="22"/>
-                <w:szCs w:val="22"/>
-              </w:rPr>
-              <w:t xml:space="preserve">Discovery Holiday Parks AU @ </w:t>
+              <w:t xml:space="preserve">Client: Discovery Holiday Parks AU @ </w:t>
             </w:r>
             <w:proofErr w:type="spellStart"/>
             <w:r>
@@ -924,6 +823,40 @@
           </w:p>
           <w:p>
             <w:pPr>
+              <w:spacing w:after="70"/>
+              <w:ind w:left="280" w:hanging="200"/>
+              <w:rPr>
+                <w:rFonts w:ascii="Calibri" w:eastAsia="Calibri" w:hAnsi="Calibri" w:cs="Calibri"/>
+                <w:color w:val="2C2C2C"/>
+              </w:rPr>
+            </w:pPr>
+            <w:r>
+              <w:rPr>
+                <w:rFonts w:ascii="Calibri" w:eastAsia="Calibri" w:hAnsi="Calibri" w:cs="Calibri"/>
+                <w:color w:val="2C2C2C"/>
+              </w:rPr>
+              <w:t xml:space="preserve">• </w:t>
+            </w:r>
+            <w:r>
+              <w:rPr>
+                <w:rFonts w:ascii="Calibri" w:eastAsia="Calibri" w:hAnsi="Calibri" w:cs="Calibri"/>
+                <w:color w:val="2C2C2C"/>
+              </w:rPr>
+              <w:t>Enforced code quality and maintainability standards on the Deals backend using SonarQube static analysis, addressing code smells, vulnerabilities, and coverage gaps as part of the CI pipeline.</w:t>
+            </w:r>
+          </w:p>
+          <w:p>
+            <w:pPr>
+              <w:spacing w:after="70"/>
+              <w:ind w:left="280" w:hanging="200"/>
+              <w:rPr>
+                <w:rFonts w:ascii="Calibri" w:eastAsia="Calibri" w:hAnsi="Calibri" w:cs="Calibri"/>
+                <w:color w:val="2C2C2C"/>
+              </w:rPr>
+            </w:pPr>
+          </w:p>
+          <w:p>
+            <w:pPr>
               <w:tabs>
                 <w:tab w:val="right" w:pos="8040"/>
               </w:tabs>
@@ -1077,6 +1010,10 @@
             <w:pPr>
               <w:spacing w:after="70"/>
               <w:ind w:left="280" w:hanging="200"/>
+              <w:rPr>
+                <w:rFonts w:ascii="Calibri" w:eastAsia="Calibri" w:hAnsi="Calibri" w:cs="Calibri"/>
+                <w:color w:val="2C2C2C"/>
+              </w:rPr>
             </w:pPr>
             <w:r>
               <w:rPr>
@@ -1084,6 +1021,42 @@
                 <w:color w:val="2C2C2C"/>
               </w:rPr>
               <w:t>• Participated in code review sessions, enforcing coding standards and maintainability.</w:t>
+            </w:r>
+          </w:p>
+          <w:p>
+            <w:pPr>
+              <w:spacing w:after="70"/>
+              <w:ind w:left="280" w:hanging="200"/>
+            </w:pPr>
+            <w:r>
+              <w:rPr>
+                <w:rFonts w:ascii="Calibri" w:eastAsia="Calibri" w:hAnsi="Calibri" w:cs="Calibri"/>
+                <w:color w:val="2C2C2C"/>
+              </w:rPr>
+              <w:t xml:space="preserve">• </w:t>
+            </w:r>
+            <w:r>
+              <w:rPr>
+                <w:rFonts w:ascii="Calibri" w:eastAsia="Calibri" w:hAnsi="Calibri" w:cs="Calibri"/>
+                <w:color w:val="2C2C2C"/>
+              </w:rPr>
+              <w:t xml:space="preserve">Utilized </w:t>
+            </w:r>
+            <w:proofErr w:type="spellStart"/>
+            <w:r>
+              <w:rPr>
+                <w:rFonts w:ascii="Calibri" w:eastAsia="Calibri" w:hAnsi="Calibri" w:cs="Calibri"/>
+                <w:color w:val="2C2C2C"/>
+              </w:rPr>
+              <w:t>Snyk</w:t>
+            </w:r>
+            <w:proofErr w:type="spellEnd"/>
+            <w:r>
+              <w:rPr>
+                <w:rFonts w:ascii="Calibri" w:eastAsia="Calibri" w:hAnsi="Calibri" w:cs="Calibri"/>
+                <w:color w:val="2C2C2C"/>
+              </w:rPr>
+              <w:t xml:space="preserve"> for automated vulnerability and dependency security scanning as part of the development workflow</w:t>
             </w:r>
           </w:p>
           <w:p>
@@ -1147,8 +1120,6 @@
                 <w:tab w:val="right" w:pos="8040"/>
               </w:tabs>
               <w:spacing w:before="180" w:after="30"/>
-            </w:pPr>
-            <w:r>
               <w:rPr>
                 <w:rFonts w:ascii="Calibri" w:eastAsia="Calibri" w:hAnsi="Calibri" w:cs="Calibri"/>
                 <w:b/>
@@ -1157,98 +1128,7 @@
                 <w:sz w:val="24"/>
                 <w:szCs w:val="24"/>
               </w:rPr>
-              <w:t>Senior Engineer</w:t>
-            </w:r>
-            <w:r>
-              <w:rPr>
-                <w:rFonts w:ascii="Calibri" w:eastAsia="Calibri" w:hAnsi="Calibri" w:cs="Calibri"/>
-                <w:color w:val="6B7280"/>
-              </w:rPr>
-              <w:tab/>
-              <w:t>2011 – 2021</w:t>
-            </w:r>
-          </w:p>
-          <w:p>
-            <w:pPr>
-              <w:spacing w:after="100"/>
-            </w:pPr>
-            <w:r>
-              <w:rPr>
-                <w:rFonts w:ascii="Calibri" w:eastAsia="Calibri" w:hAnsi="Calibri" w:cs="Calibri"/>
-                <w:b/>
-                <w:bCs/>
-                <w:color w:val="1E7F76"/>
-                <w:sz w:val="22"/>
-                <w:szCs w:val="22"/>
-              </w:rPr>
-              <w:t>Renesas Semiconductor KL SDN BHD, Kuala Langat, Malaysia</w:t>
-            </w:r>
-          </w:p>
-          <w:p>
-            <w:pPr>
-              <w:spacing w:after="70"/>
-              <w:ind w:left="280" w:hanging="200"/>
-            </w:pPr>
-            <w:r>
-              <w:rPr>
-                <w:rFonts w:ascii="Calibri" w:eastAsia="Calibri" w:hAnsi="Calibri" w:cs="Calibri"/>
-                <w:color w:val="2C2C2C"/>
-              </w:rPr>
-              <w:t>• Maintained 99% uptime for the Manufacturing Execution System (MES), ensuring reliable production operations.</w:t>
-            </w:r>
-          </w:p>
-          <w:p>
-            <w:pPr>
-              <w:spacing w:after="70"/>
-              <w:ind w:left="280" w:hanging="200"/>
-            </w:pPr>
-            <w:r>
-              <w:rPr>
-                <w:rFonts w:ascii="Calibri" w:eastAsia="Calibri" w:hAnsi="Calibri" w:cs="Calibri"/>
-                <w:color w:val="2C2C2C"/>
-              </w:rPr>
-              <w:t>• Designed and delivered automation solutions by analyzing production workflows, collaborating with users, and resolving system bottlenecks — increasing productivity by 75%, generating over MYR 1M in time savings, and implementing Poka-Yoke (mistake-proofing) processes.</w:t>
-            </w:r>
-          </w:p>
-          <w:p>
-            <w:pPr>
-              <w:spacing w:after="70"/>
-              <w:ind w:left="280" w:hanging="200"/>
-            </w:pPr>
-            <w:r>
-              <w:rPr>
-                <w:rFonts w:ascii="Calibri" w:eastAsia="Calibri" w:hAnsi="Calibri" w:cs="Calibri"/>
-                <w:color w:val="2C2C2C"/>
-              </w:rPr>
-              <w:t>• Administered over 100 servers running on physical, VMware, and Hyper-V infrastructure, including in-house and Japan Software databases running on Oracle and MS SQL.</w:t>
-            </w:r>
-          </w:p>
-          <w:p>
-            <w:pPr>
-              <w:spacing w:after="70"/>
-              <w:ind w:left="280" w:hanging="200"/>
-            </w:pPr>
-            <w:r>
-              <w:rPr>
-                <w:rFonts w:ascii="Calibri" w:eastAsia="Calibri" w:hAnsi="Calibri" w:cs="Calibri"/>
-                <w:color w:val="2C2C2C"/>
-              </w:rPr>
-              <w:lastRenderedPageBreak/>
-              <w:t>• Developed system integrations between SAP and MES, automating material master registration and production planning processes.</w:t>
-            </w:r>
-          </w:p>
-          <w:p>
-            <w:pPr>
-              <w:spacing w:after="70"/>
-              <w:ind w:left="280" w:hanging="200"/>
-            </w:pPr>
-            <w:r>
-              <w:rPr>
-                <w:rFonts w:ascii="Calibri" w:eastAsia="Calibri" w:hAnsi="Calibri" w:cs="Calibri"/>
-                <w:color w:val="2C2C2C"/>
-              </w:rPr>
-              <w:t>• Built interactive management dashboards and analytics using TIBCO Spotfire, enabling faster operational insights and decision-making.</w:t>
-            </w:r>
+            </w:pPr>
           </w:p>
           <w:p>
             <w:pPr>
@@ -1256,8 +1136,6 @@
                 <w:tab w:val="right" w:pos="8040"/>
               </w:tabs>
               <w:spacing w:before="180" w:after="30"/>
-            </w:pPr>
-            <w:r>
               <w:rPr>
                 <w:rFonts w:ascii="Calibri" w:eastAsia="Calibri" w:hAnsi="Calibri" w:cs="Calibri"/>
                 <w:b/>
@@ -1266,82 +1144,7 @@
                 <w:sz w:val="24"/>
                 <w:szCs w:val="24"/>
               </w:rPr>
-              <w:t>IT Manager / IT Executive</w:t>
-            </w:r>
-            <w:r>
-              <w:rPr>
-                <w:rFonts w:ascii="Calibri" w:eastAsia="Calibri" w:hAnsi="Calibri" w:cs="Calibri"/>
-                <w:color w:val="6B7280"/>
-              </w:rPr>
-              <w:tab/>
-              <w:t>2008 – 2010</w:t>
-            </w:r>
-          </w:p>
-          <w:p>
-            <w:pPr>
-              <w:spacing w:after="100"/>
-            </w:pPr>
-            <w:r>
-              <w:rPr>
-                <w:rFonts w:ascii="Calibri" w:eastAsia="Calibri" w:hAnsi="Calibri" w:cs="Calibri"/>
-                <w:b/>
-                <w:bCs/>
-                <w:color w:val="1E7F76"/>
-                <w:sz w:val="22"/>
-                <w:szCs w:val="22"/>
-              </w:rPr>
-              <w:t xml:space="preserve">Grand Dragon Resorts, </w:t>
-            </w:r>
-            <w:proofErr w:type="spellStart"/>
-            <w:r>
-              <w:rPr>
-                <w:rFonts w:ascii="Calibri" w:eastAsia="Calibri" w:hAnsi="Calibri" w:cs="Calibri"/>
-                <w:b/>
-                <w:bCs/>
-                <w:color w:val="1E7F76"/>
-                <w:sz w:val="22"/>
-                <w:szCs w:val="22"/>
-              </w:rPr>
-              <w:t>Chrey</w:t>
-            </w:r>
-            <w:proofErr w:type="spellEnd"/>
-            <w:r>
-              <w:rPr>
-                <w:rFonts w:ascii="Calibri" w:eastAsia="Calibri" w:hAnsi="Calibri" w:cs="Calibri"/>
-                <w:b/>
-                <w:bCs/>
-                <w:color w:val="1E7F76"/>
-                <w:sz w:val="22"/>
-                <w:szCs w:val="22"/>
-              </w:rPr>
-              <w:t xml:space="preserve"> Thom, Cambodia</w:t>
-            </w:r>
-          </w:p>
-          <w:p>
-            <w:pPr>
-              <w:spacing w:after="70"/>
-              <w:ind w:left="280" w:hanging="200"/>
-            </w:pPr>
-            <w:r>
-              <w:rPr>
-                <w:rFonts w:ascii="Calibri" w:eastAsia="Calibri" w:hAnsi="Calibri" w:cs="Calibri"/>
-                <w:color w:val="2C2C2C"/>
-              </w:rPr>
-              <w:t>• As IT Manager: led project planning, resourcing, documentation, and client engagement; cleared risks so deliverables shipped on time.</w:t>
-            </w:r>
-          </w:p>
-          <w:p>
-            <w:pPr>
-              <w:spacing w:after="70"/>
-              <w:ind w:left="280" w:hanging="200"/>
-            </w:pPr>
-            <w:r>
-              <w:rPr>
-                <w:rFonts w:ascii="Calibri" w:eastAsia="Calibri" w:hAnsi="Calibri" w:cs="Calibri"/>
-                <w:color w:val="2C2C2C"/>
-              </w:rPr>
-              <w:t>• As IT Executive: delivered in-house Point of Sales (POS), Casino Management (CMS), and Automated Timekeeping System with Biometric (ATS); fully automated previously manual processes where applicable.</w:t>
-            </w:r>
+            </w:pPr>
           </w:p>
           <w:p>
             <w:pPr>
@@ -1359,7 +1162,8 @@
                 <w:sz w:val="24"/>
                 <w:szCs w:val="24"/>
               </w:rPr>
-              <w:t>Senior Programmer / Junior Programmer</w:t>
+              <w:lastRenderedPageBreak/>
+              <w:t>Senior Engineer</w:t>
             </w:r>
             <w:r>
               <w:rPr>
@@ -1367,7 +1171,7 @@
                 <w:color w:val="6B7280"/>
               </w:rPr>
               <w:tab/>
-              <w:t>2005 – 2008</w:t>
+              <w:t>2011 – 2021</w:t>
             </w:r>
           </w:p>
           <w:p>
@@ -1383,7 +1187,7 @@
                 <w:sz w:val="22"/>
                 <w:szCs w:val="22"/>
               </w:rPr>
-              <w:t>Subic Bay Yacht Club, Subic Bay Olongapo, Philippines</w:t>
+              <w:t>Renesas Semiconductor KL SDN BHD, Kuala Langat, Malaysia</w:t>
             </w:r>
           </w:p>
           <w:p>
@@ -1396,23 +1200,7 @@
                 <w:rFonts w:ascii="Calibri" w:eastAsia="Calibri" w:hAnsi="Calibri" w:cs="Calibri"/>
                 <w:color w:val="2C2C2C"/>
               </w:rPr>
-              <w:t xml:space="preserve">• As Senior Programmer: designed and built club systems covering employment, payroll, timekeeping, billing/collections, accounts payable, and POS for revenue </w:t>
-            </w:r>
-            <w:proofErr w:type="spellStart"/>
-            <w:r>
-              <w:rPr>
-                <w:rFonts w:ascii="Calibri" w:eastAsia="Calibri" w:hAnsi="Calibri" w:cs="Calibri"/>
-                <w:color w:val="2C2C2C"/>
-              </w:rPr>
-              <w:t>centres</w:t>
-            </w:r>
-            <w:proofErr w:type="spellEnd"/>
-            <w:r>
-              <w:rPr>
-                <w:rFonts w:ascii="Calibri" w:eastAsia="Calibri" w:hAnsi="Calibri" w:cs="Calibri"/>
-                <w:color w:val="2C2C2C"/>
-              </w:rPr>
-              <w:t xml:space="preserve"> and retail.</w:t>
+              <w:t>• Maintained 99% uptime for the Manufacturing Execution System (MES), ensuring reliable production operations.</w:t>
             </w:r>
           </w:p>
           <w:p>
@@ -1425,13 +1213,249 @@
                 <w:rFonts w:ascii="Calibri" w:eastAsia="Calibri" w:hAnsi="Calibri" w:cs="Calibri"/>
                 <w:color w:val="2C2C2C"/>
               </w:rPr>
-              <w:t>• Administered Windows Server, SCO UNIX, Novell NetWare, Oracle OPERA 4.04 PMS, and Micros-Fidelio; handled database tuning, indexing, and security.</w:t>
+              <w:t>• Designed and delivered automation solutions by analyzing production workflows, collaborating with users, and resolving system bottlenecks — increasing productivity by 75%, generating over MYR 1M in time savings, and implementing Poka-Yoke (mistake-proofing) processes.</w:t>
             </w:r>
           </w:p>
           <w:p>
             <w:pPr>
               <w:spacing w:after="70"/>
               <w:ind w:left="280" w:hanging="200"/>
+            </w:pPr>
+            <w:r>
+              <w:rPr>
+                <w:rFonts w:ascii="Calibri" w:eastAsia="Calibri" w:hAnsi="Calibri" w:cs="Calibri"/>
+                <w:color w:val="2C2C2C"/>
+              </w:rPr>
+              <w:t xml:space="preserve">• Administered over 100 servers running on physical, VMware, and Hyper-V infrastructure, </w:t>
+            </w:r>
+            <w:r>
+              <w:rPr>
+                <w:rFonts w:ascii="Calibri" w:eastAsia="Calibri" w:hAnsi="Calibri" w:cs="Calibri"/>
+                <w:color w:val="2C2C2C"/>
+              </w:rPr>
+              <w:t>including in-house and Japan-developed systems using Oracle and MS SQL databases</w:t>
+            </w:r>
+          </w:p>
+          <w:p>
+            <w:pPr>
+              <w:spacing w:after="70"/>
+              <w:ind w:left="280" w:hanging="200"/>
+            </w:pPr>
+            <w:r>
+              <w:rPr>
+                <w:rFonts w:ascii="Calibri" w:eastAsia="Calibri" w:hAnsi="Calibri" w:cs="Calibri"/>
+                <w:color w:val="2C2C2C"/>
+              </w:rPr>
+              <w:t>• Developed system integrations between SAP and MES, automating material master registration and production planning processes.</w:t>
+            </w:r>
+          </w:p>
+          <w:p>
+            <w:pPr>
+              <w:spacing w:after="70"/>
+              <w:ind w:left="280" w:hanging="200"/>
+              <w:rPr>
+                <w:rFonts w:ascii="Calibri" w:eastAsia="Calibri" w:hAnsi="Calibri" w:cs="Calibri"/>
+                <w:color w:val="2C2C2C"/>
+              </w:rPr>
+            </w:pPr>
+            <w:r>
+              <w:rPr>
+                <w:rFonts w:ascii="Calibri" w:eastAsia="Calibri" w:hAnsi="Calibri" w:cs="Calibri"/>
+                <w:color w:val="2C2C2C"/>
+              </w:rPr>
+              <w:t>• Built interactive management dashboards and analytics using TIBCO Spotfire, enabling faster operational insights and decision-making.</w:t>
+            </w:r>
+          </w:p>
+          <w:p>
+            <w:pPr>
+              <w:tabs>
+                <w:tab w:val="right" w:pos="8040"/>
+              </w:tabs>
+              <w:spacing w:before="180" w:after="30"/>
+            </w:pPr>
+            <w:r>
+              <w:rPr>
+                <w:rFonts w:ascii="Calibri" w:eastAsia="Calibri" w:hAnsi="Calibri" w:cs="Calibri"/>
+                <w:b/>
+                <w:bCs/>
+                <w:color w:val="2C2C2C"/>
+                <w:sz w:val="24"/>
+                <w:szCs w:val="24"/>
+              </w:rPr>
+              <w:t>IT Manager / IT Executive</w:t>
+            </w:r>
+            <w:r>
+              <w:rPr>
+                <w:rFonts w:ascii="Calibri" w:eastAsia="Calibri" w:hAnsi="Calibri" w:cs="Calibri"/>
+                <w:color w:val="6B7280"/>
+              </w:rPr>
+              <w:tab/>
+              <w:t>2008 – 2010</w:t>
+            </w:r>
+          </w:p>
+          <w:p>
+            <w:pPr>
+              <w:spacing w:after="100"/>
+            </w:pPr>
+            <w:r>
+              <w:rPr>
+                <w:rFonts w:ascii="Calibri" w:eastAsia="Calibri" w:hAnsi="Calibri" w:cs="Calibri"/>
+                <w:b/>
+                <w:bCs/>
+                <w:color w:val="1E7F76"/>
+                <w:sz w:val="22"/>
+                <w:szCs w:val="22"/>
+              </w:rPr>
+              <w:t xml:space="preserve">Grand Dragon Resorts, </w:t>
+            </w:r>
+            <w:proofErr w:type="spellStart"/>
+            <w:r>
+              <w:rPr>
+                <w:rFonts w:ascii="Calibri" w:eastAsia="Calibri" w:hAnsi="Calibri" w:cs="Calibri"/>
+                <w:b/>
+                <w:bCs/>
+                <w:color w:val="1E7F76"/>
+                <w:sz w:val="22"/>
+                <w:szCs w:val="22"/>
+              </w:rPr>
+              <w:t>Chrey</w:t>
+            </w:r>
+            <w:proofErr w:type="spellEnd"/>
+            <w:r>
+              <w:rPr>
+                <w:rFonts w:ascii="Calibri" w:eastAsia="Calibri" w:hAnsi="Calibri" w:cs="Calibri"/>
+                <w:b/>
+                <w:bCs/>
+                <w:color w:val="1E7F76"/>
+                <w:sz w:val="22"/>
+                <w:szCs w:val="22"/>
+              </w:rPr>
+              <w:t xml:space="preserve"> Thom, Cambodia</w:t>
+            </w:r>
+          </w:p>
+          <w:p>
+            <w:pPr>
+              <w:spacing w:after="70"/>
+              <w:ind w:left="280" w:hanging="200"/>
+            </w:pPr>
+            <w:r>
+              <w:rPr>
+                <w:rFonts w:ascii="Calibri" w:eastAsia="Calibri" w:hAnsi="Calibri" w:cs="Calibri"/>
+                <w:color w:val="2C2C2C"/>
+              </w:rPr>
+              <w:t>• As IT Manager: led project planning, resourcing, documentation, and client engagement; cleared risks so deliverables shipped on time.</w:t>
+            </w:r>
+          </w:p>
+          <w:p>
+            <w:pPr>
+              <w:spacing w:after="70"/>
+              <w:ind w:left="280" w:hanging="200"/>
+              <w:rPr>
+                <w:rFonts w:ascii="Calibri" w:eastAsia="Calibri" w:hAnsi="Calibri" w:cs="Calibri"/>
+                <w:color w:val="2C2C2C"/>
+              </w:rPr>
+            </w:pPr>
+            <w:r>
+              <w:rPr>
+                <w:rFonts w:ascii="Calibri" w:eastAsia="Calibri" w:hAnsi="Calibri" w:cs="Calibri"/>
+                <w:color w:val="2C2C2C"/>
+              </w:rPr>
+              <w:t>• As IT Executive: delivered in-house Point of Sales (POS), Casino Management (CMS), and Automated Timekeeping System with Biometric (ATS); fully automated previously manual processes where applicable.</w:t>
+            </w:r>
+          </w:p>
+          <w:p>
+            <w:pPr>
+              <w:tabs>
+                <w:tab w:val="right" w:pos="8040"/>
+              </w:tabs>
+              <w:spacing w:before="180" w:after="30"/>
+            </w:pPr>
+            <w:r>
+              <w:rPr>
+                <w:rFonts w:ascii="Calibri" w:eastAsia="Calibri" w:hAnsi="Calibri" w:cs="Calibri"/>
+                <w:b/>
+                <w:bCs/>
+                <w:color w:val="2C2C2C"/>
+                <w:sz w:val="24"/>
+                <w:szCs w:val="24"/>
+              </w:rPr>
+              <w:t>Senior Programmer / Junior Programmer</w:t>
+            </w:r>
+            <w:r>
+              <w:rPr>
+                <w:rFonts w:ascii="Calibri" w:eastAsia="Calibri" w:hAnsi="Calibri" w:cs="Calibri"/>
+                <w:color w:val="6B7280"/>
+              </w:rPr>
+              <w:tab/>
+              <w:t>2005 – 2008</w:t>
+            </w:r>
+          </w:p>
+          <w:p>
+            <w:pPr>
+              <w:spacing w:after="100"/>
+            </w:pPr>
+            <w:r>
+              <w:rPr>
+                <w:rFonts w:ascii="Calibri" w:eastAsia="Calibri" w:hAnsi="Calibri" w:cs="Calibri"/>
+                <w:b/>
+                <w:bCs/>
+                <w:color w:val="1E7F76"/>
+                <w:sz w:val="22"/>
+                <w:szCs w:val="22"/>
+              </w:rPr>
+              <w:t>Subic Bay Yacht Club, Subic Bay Olongapo, Philippines</w:t>
+            </w:r>
+          </w:p>
+          <w:p>
+            <w:pPr>
+              <w:spacing w:after="70"/>
+              <w:ind w:left="280" w:hanging="200"/>
+            </w:pPr>
+            <w:r>
+              <w:rPr>
+                <w:rFonts w:ascii="Calibri" w:eastAsia="Calibri" w:hAnsi="Calibri" w:cs="Calibri"/>
+                <w:color w:val="2C2C2C"/>
+              </w:rPr>
+              <w:t xml:space="preserve">• As Senior Programmer: designed and built club systems covering employment, payroll, timekeeping, billing/collections, accounts payable, and POS for revenue </w:t>
+            </w:r>
+            <w:proofErr w:type="spellStart"/>
+            <w:r>
+              <w:rPr>
+                <w:rFonts w:ascii="Calibri" w:eastAsia="Calibri" w:hAnsi="Calibri" w:cs="Calibri"/>
+                <w:color w:val="2C2C2C"/>
+              </w:rPr>
+              <w:t>centres</w:t>
+            </w:r>
+            <w:proofErr w:type="spellEnd"/>
+            <w:r>
+              <w:rPr>
+                <w:rFonts w:ascii="Calibri" w:eastAsia="Calibri" w:hAnsi="Calibri" w:cs="Calibri"/>
+                <w:color w:val="2C2C2C"/>
+              </w:rPr>
+              <w:t xml:space="preserve"> and retail.</w:t>
+            </w:r>
+          </w:p>
+          <w:p>
+            <w:pPr>
+              <w:spacing w:after="70"/>
+              <w:ind w:left="280" w:hanging="200"/>
+            </w:pPr>
+            <w:r>
+              <w:rPr>
+                <w:rFonts w:ascii="Calibri" w:eastAsia="Calibri" w:hAnsi="Calibri" w:cs="Calibri"/>
+                <w:color w:val="2C2C2C"/>
+              </w:rPr>
+              <w:t>• Administered Windows Server, SCO UNIX, Novell NetWare, Oracle OPERA 4.04 PMS, and Micros-Fidelio; handled database tuning, indexing, and security.</w:t>
+            </w:r>
+          </w:p>
+          <w:p>
+            <w:pPr>
+              <w:spacing w:after="70"/>
+              <w:ind w:left="280" w:hanging="200"/>
+              <w:rPr>
+                <w:rFonts w:ascii="Calibri" w:eastAsia="Calibri" w:hAnsi="Calibri" w:cs="Calibri"/>
+                <w:color w:val="2C2C2C"/>
+              </w:rPr>
             </w:pPr>
             <w:r>
               <w:rPr>
@@ -1508,6 +1532,43 @@
               </w:rPr>
               <w:t>No Code Automation with Zapier (2026)</w:t>
             </w:r>
+            <w:r>
+              <w:rPr>
+                <w:rFonts w:ascii="Calibri" w:eastAsia="Calibri" w:hAnsi="Calibri" w:cs="Calibri"/>
+                <w:color w:val="2C2C2C"/>
+              </w:rPr>
+              <w:t xml:space="preserve"> </w:t>
+            </w:r>
+            <w:r>
+              <w:rPr>
+                <w:rFonts w:ascii="Calibri" w:eastAsia="Calibri" w:hAnsi="Calibri" w:cs="Calibri"/>
+                <w:color w:val="1E7F76"/>
+              </w:rPr>
+              <w:t xml:space="preserve">• </w:t>
+            </w:r>
+            <w:r>
+              <w:rPr>
+                <w:rFonts w:ascii="Calibri" w:eastAsia="Calibri" w:hAnsi="Calibri" w:cs="Calibri"/>
+                <w:color w:val="2C2C2C"/>
+              </w:rPr>
+              <w:t xml:space="preserve">QS101: N8N </w:t>
+            </w:r>
+            <w:proofErr w:type="spellStart"/>
+            <w:r>
+              <w:rPr>
+                <w:rFonts w:ascii="Calibri" w:eastAsia="Calibri" w:hAnsi="Calibri" w:cs="Calibri"/>
+                <w:color w:val="2C2C2C"/>
+              </w:rPr>
+              <w:t>Quickstart</w:t>
+            </w:r>
+            <w:proofErr w:type="spellEnd"/>
+            <w:r>
+              <w:rPr>
+                <w:rFonts w:ascii="Calibri" w:eastAsia="Calibri" w:hAnsi="Calibri" w:cs="Calibri"/>
+                <w:color w:val="2C2C2C"/>
+              </w:rPr>
+              <w:t xml:space="preserve"> (2026)</w:t>
+            </w:r>
           </w:p>
           <w:p>
             <w:pPr>
@@ -1526,7 +1587,7 @@
                 <w:rFonts w:ascii="Calibri" w:eastAsia="Calibri" w:hAnsi="Calibri" w:cs="Calibri"/>
                 <w:color w:val="2C2C2C"/>
               </w:rPr>
-              <w:t xml:space="preserve">QS101: N8N </w:t>
+              <w:t xml:space="preserve">The Complete </w:t>
             </w:r>
             <w:proofErr w:type="spellStart"/>
             <w:r>
@@ -1534,7 +1595,7 @@
                 <w:rFonts w:ascii="Calibri" w:eastAsia="Calibri" w:hAnsi="Calibri" w:cs="Calibri"/>
                 <w:color w:val="2C2C2C"/>
               </w:rPr>
-              <w:t>Quickstart</w:t>
+              <w:t>ReactJs</w:t>
             </w:r>
             <w:proofErr w:type="spellEnd"/>
             <w:r>
@@ -1542,7 +1603,7 @@
                 <w:rFonts w:ascii="Calibri" w:eastAsia="Calibri" w:hAnsi="Calibri" w:cs="Calibri"/>
                 <w:color w:val="2C2C2C"/>
               </w:rPr>
-              <w:t xml:space="preserve"> (2026)</w:t>
+              <w:t xml:space="preserve"> Course - Basics to Advanced (2026)</w:t>
             </w:r>
           </w:p>
           <w:p>
@@ -1562,23 +1623,7 @@
                 <w:rFonts w:ascii="Calibri" w:eastAsia="Calibri" w:hAnsi="Calibri" w:cs="Calibri"/>
                 <w:color w:val="2C2C2C"/>
               </w:rPr>
-              <w:t xml:space="preserve">The Complete </w:t>
-            </w:r>
-            <w:proofErr w:type="spellStart"/>
-            <w:r>
-              <w:rPr>
-                <w:rFonts w:ascii="Calibri" w:eastAsia="Calibri" w:hAnsi="Calibri" w:cs="Calibri"/>
-                <w:color w:val="2C2C2C"/>
-              </w:rPr>
-              <w:t>ReactJs</w:t>
-            </w:r>
-            <w:proofErr w:type="spellEnd"/>
-            <w:r>
-              <w:rPr>
-                <w:rFonts w:ascii="Calibri" w:eastAsia="Calibri" w:hAnsi="Calibri" w:cs="Calibri"/>
-                <w:color w:val="2C2C2C"/>
-              </w:rPr>
-              <w:t xml:space="preserve"> Course - Basics to Advanced (2026)</w:t>
+              <w:t>Google AI Studio Bootcamp: Build Pro Apps with Gemini (2026)</w:t>
             </w:r>
           </w:p>
           <w:p>
@@ -1598,7 +1643,7 @@
                 <w:rFonts w:ascii="Calibri" w:eastAsia="Calibri" w:hAnsi="Calibri" w:cs="Calibri"/>
                 <w:color w:val="2C2C2C"/>
               </w:rPr>
-              <w:t>Google AI Studio Bootcamp: Build Pro Apps with Gemini (2026)</w:t>
+              <w:t>Claude Pro: Build, Integrate &amp; Optimize AI Solutions (2026)</w:t>
             </w:r>
           </w:p>
           <w:p>
@@ -1618,7 +1663,7 @@
                 <w:rFonts w:ascii="Calibri" w:eastAsia="Calibri" w:hAnsi="Calibri" w:cs="Calibri"/>
                 <w:color w:val="2C2C2C"/>
               </w:rPr>
-              <w:t>Claude Pro: Build, Integrate &amp; Optimize AI Solutions (2026)</w:t>
+              <w:t>Learn Infra as a Code with Azure Bicep (2025)</w:t>
             </w:r>
           </w:p>
           <w:p>
@@ -1638,7 +1683,7 @@
                 <w:rFonts w:ascii="Calibri" w:eastAsia="Calibri" w:hAnsi="Calibri" w:cs="Calibri"/>
                 <w:color w:val="2C2C2C"/>
               </w:rPr>
-              <w:t>Learn Infra as a Code with Azure Bicep (2025)</w:t>
+              <w:t>Learn Azure DevOps CI/CD pipelines (2025)</w:t>
             </w:r>
           </w:p>
           <w:p>
@@ -1658,13 +1703,17 @@
                 <w:rFonts w:ascii="Calibri" w:eastAsia="Calibri" w:hAnsi="Calibri" w:cs="Calibri"/>
                 <w:color w:val="2C2C2C"/>
               </w:rPr>
-              <w:t>Learn Azure DevOps CI/CD pipelines (2025)</w:t>
+              <w:t>Code Reviews for Secure, Clean, and Scalable Code (2024)</w:t>
             </w:r>
           </w:p>
           <w:p>
             <w:pPr>
               <w:spacing w:after="90"/>
               <w:ind w:left="220" w:hanging="220"/>
+              <w:rPr>
+                <w:rFonts w:ascii="Calibri" w:eastAsia="Calibri" w:hAnsi="Calibri" w:cs="Calibri"/>
+                <w:color w:val="2C2C2C"/>
+              </w:rPr>
             </w:pPr>
             <w:r>
               <w:rPr>
@@ -1678,51 +1727,7 @@
                 <w:rFonts w:ascii="Calibri" w:eastAsia="Calibri" w:hAnsi="Calibri" w:cs="Calibri"/>
                 <w:color w:val="2C2C2C"/>
               </w:rPr>
-              <w:t>Code Reviews for Secure, Clean, and Scalable Code (2024)</w:t>
-            </w:r>
-          </w:p>
-          <w:p>
-            <w:pPr>
-              <w:spacing w:after="90"/>
-              <w:ind w:left="220" w:hanging="220"/>
-              <w:rPr>
-                <w:rFonts w:ascii="Calibri" w:eastAsia="Calibri" w:hAnsi="Calibri" w:cs="Calibri"/>
-                <w:color w:val="2C2C2C"/>
-              </w:rPr>
-            </w:pPr>
-            <w:r>
-              <w:rPr>
-                <w:rFonts w:ascii="Calibri" w:eastAsia="Calibri" w:hAnsi="Calibri" w:cs="Calibri"/>
-                <w:color w:val="1E7F76"/>
-              </w:rPr>
-              <w:t xml:space="preserve">• </w:t>
-            </w:r>
-            <w:r>
-              <w:rPr>
-                <w:rFonts w:ascii="Calibri" w:eastAsia="Calibri" w:hAnsi="Calibri" w:cs="Calibri"/>
-                <w:color w:val="2C2C2C"/>
-              </w:rPr>
               <w:t>Data Engineering Pathway (2023)</w:t>
-            </w:r>
-          </w:p>
-          <w:p>
-            <w:pPr>
-              <w:spacing w:after="90"/>
-              <w:ind w:left="220" w:hanging="220"/>
-            </w:pPr>
-            <w:r>
-              <w:rPr>
-                <w:rFonts w:ascii="Calibri" w:eastAsia="Calibri" w:hAnsi="Calibri" w:cs="Calibri"/>
-                <w:color w:val="1E7F76"/>
-              </w:rPr>
-              <w:t xml:space="preserve">• </w:t>
-            </w:r>
-            <w:r>
-              <w:rPr>
-                <w:rFonts w:ascii="Calibri" w:eastAsia="Calibri" w:hAnsi="Calibri" w:cs="Calibri"/>
-                <w:color w:val="2C2C2C"/>
-              </w:rPr>
-              <w:t>Data Science and Machine Learning Using Python (2022)</w:t>
             </w:r>
           </w:p>
           <w:p>
@@ -1821,19 +1826,20 @@
               </w:rPr>
               <w:t xml:space="preserve"> (Regional and National Level), Deans Lister and Honorable Mention and Programmer of the Year</w:t>
             </w:r>
-          </w:p>
-          <w:p>
-            <w:pPr>
-              <w:spacing w:after="90"/>
-              <w:ind w:left="220" w:hanging="220"/>
-            </w:pPr>
+            <w:r>
+              <w:rPr>
+                <w:rFonts w:ascii="Calibri" w:eastAsia="Calibri" w:hAnsi="Calibri" w:cs="Calibri"/>
+                <w:color w:val="2C2C2C"/>
+              </w:rPr>
+              <w:t>.</w:t>
+            </w:r>
           </w:p>
         </w:tc>
       </w:tr>
     </w:tbl>
     <w:p/>
     <w:sectPr>
-      <w:headerReference w:type="default" r:id="rId7"/>
+      <w:headerReference w:type="default" r:id="rId8"/>
       <w:pgSz w:w="12240" w:h="15840"/>
       <w:pgMar w:top="0" w:right="0" w:bottom="0" w:left="0" w:header="0" w:footer="0" w:gutter="0"/>
       <w:cols w:space="720"/>
@@ -1889,7 +1895,7 @@
         <w:noProof/>
       </w:rPr>
       <w:drawing>
-        <wp:anchor distT="0" distB="0" distL="0" distR="0" simplePos="0" relativeHeight="10058400" behindDoc="1" locked="0" layoutInCell="1" allowOverlap="1" wp14:anchorId="54FF70F0" wp14:editId="669C82AC">
+        <wp:anchor distT="0" distB="0" distL="0" distR="0" simplePos="0" relativeHeight="10058400" behindDoc="1" locked="0" layoutInCell="1" allowOverlap="1" wp14:anchorId="2314E5FE" wp14:editId="73C801B5">
           <wp:simplePos x="0" y="0"/>
           <wp:positionH relativeFrom="page">
             <wp:posOffset>0</wp:posOffset>
@@ -1942,6 +1948,119 @@
 <file path=word/numbering.xml><?xml version="1.0" encoding="utf-8"?>
 <w:numbering xmlns:wpc="http://schemas.microsoft.com/office/word/2010/wordprocessingCanvas" xmlns:cx="http://schemas.microsoft.com/office/drawing/2014/chartex" xmlns:cx1="http://schemas.microsoft.com/office/drawing/2015/9/8/chartex" xmlns:cx2="http://schemas.microsoft.com/office/drawing/2015/10/21/chartex" xmlns:cx3="http://schemas.microsoft.com/office/drawing/2016/5/9/chartex" xmlns:cx4="http://schemas.microsoft.com/office/drawing/2016/5/10/chartex" xmlns:cx5="http://schemas.microsoft.com/office/drawing/2016/5/11/chartex" xmlns:cx6="http://schemas.microsoft.com/office/drawing/2016/5/12/chartex" xmlns:cx7="http://schemas.microsoft.com/office/drawing/2016/5/13/chartex" xmlns:cx8="http://schemas.microsoft.com/office/drawing/2016/5/14/chartex" xmlns:mc="http://schemas.openxmlformats.org/markup-compatibility/2006" xmlns:aink="http://schemas.microsoft.com/office/drawing/2016/ink" xmlns:am3d="http://schemas.microsoft.com/office/drawing/2017/model3d" xmlns:o="urn:schemas-microsoft-com:office:office" xmlns:r="http://schemas.openxmlformats.org/officeDocument/2006/relationships" xmlns:m="http://schemas.openxmlformats.org/officeDocument/2006/math" xmlns:v="urn:schemas-microsoft-com:vml" xmlns:wp14="http://schemas.microsoft.com/office/word/2010/wordprocessingDrawing" xmlns:wp="http://schemas.openxmlformats.org/drawingml/2006/wordprocessingDrawing" xmlns:w10="urn:schemas-microsoft-com:office:word" xmlns:w="http://schemas.openxmlformats.org/wordprocessingml/2006/main" xmlns:w14="http://schemas.microsoft.com/office/word/2010/wordml" xmlns:w15="http://schemas.microsoft.com/office/word/2012/wordml" xmlns:w16cex="http://schemas.microsoft.com/office/word/2018/wordml/cex" xmlns:w16cid="http://schemas.microsoft.com/office/word/2016/wordml/cid" xmlns:w16="http://schemas.microsoft.com/office/word/2018/wordml" xmlns:w16sdtdh="http://schemas.microsoft.com/office/word/2020/wordml/sdtdatahash" xmlns:w16se="http://schemas.microsoft.com/office/word/2015/wordml/symex" xmlns:wpg="http://schemas.microsoft.com/office/word/2010/wordprocessingGroup" xmlns:wpi="http://schemas.microsoft.com/office/word/2010/wordprocessingInk" xmlns:wne="http://schemas.microsoft.com/office/word/2006/wordml" xmlns:wps="http://schemas.microsoft.com/office/word/2010/wordprocessingShape" mc:Ignorable="w14 w15 w16se w16cid w16 w16cex w16sdtdh wp14">
   <w:abstractNum w:abstractNumId="0" w15:restartNumberingAfterBreak="0">
+    <w:nsid w:val="5CAD2922"/>
+    <w:multiLevelType w:val="hybridMultilevel"/>
+    <w:tmpl w:val="4B2432E0"/>
+    <w:lvl w:ilvl="0" w:tplc="34090001">
+      <w:start w:val="1"/>
+      <w:numFmt w:val="bullet"/>
+      <w:lvlText w:val=""/>
+      <w:lvlJc w:val="left"/>
+      <w:pPr>
+        <w:ind w:left="800" w:hanging="360"/>
+      </w:pPr>
+      <w:rPr>
+        <w:rFonts w:ascii="Symbol" w:hAnsi="Symbol" w:hint="default"/>
+      </w:rPr>
+    </w:lvl>
+    <w:lvl w:ilvl="1" w:tplc="34090003" w:tentative="1">
+      <w:start w:val="1"/>
+      <w:numFmt w:val="bullet"/>
+      <w:lvlText w:val="o"/>
+      <w:lvlJc w:val="left"/>
+      <w:pPr>
+        <w:ind w:left="1520" w:hanging="360"/>
+      </w:pPr>
+      <w:rPr>
+        <w:rFonts w:ascii="Courier New" w:hAnsi="Courier New" w:cs="Courier New" w:hint="default"/>
+      </w:rPr>
+    </w:lvl>
+    <w:lvl w:ilvl="2" w:tplc="34090005" w:tentative="1">
+      <w:start w:val="1"/>
+      <w:numFmt w:val="bullet"/>
+      <w:lvlText w:val=""/>
+      <w:lvlJc w:val="left"/>
+      <w:pPr>
+        <w:ind w:left="2240" w:hanging="360"/>
+      </w:pPr>
+      <w:rPr>
+        <w:rFonts w:ascii="Wingdings" w:hAnsi="Wingdings" w:hint="default"/>
+      </w:rPr>
+    </w:lvl>
+    <w:lvl w:ilvl="3" w:tplc="34090001" w:tentative="1">
+      <w:start w:val="1"/>
+      <w:numFmt w:val="bullet"/>
+      <w:lvlText w:val=""/>
+      <w:lvlJc w:val="left"/>
+      <w:pPr>
+        <w:ind w:left="2960" w:hanging="360"/>
+      </w:pPr>
+      <w:rPr>
+        <w:rFonts w:ascii="Symbol" w:hAnsi="Symbol" w:hint="default"/>
+      </w:rPr>
+    </w:lvl>
+    <w:lvl w:ilvl="4" w:tplc="34090003" w:tentative="1">
+      <w:start w:val="1"/>
+      <w:numFmt w:val="bullet"/>
+      <w:lvlText w:val="o"/>
+      <w:lvlJc w:val="left"/>
+      <w:pPr>
+        <w:ind w:left="3680" w:hanging="360"/>
+      </w:pPr>
+      <w:rPr>
+        <w:rFonts w:ascii="Courier New" w:hAnsi="Courier New" w:cs="Courier New" w:hint="default"/>
+      </w:rPr>
+    </w:lvl>
+    <w:lvl w:ilvl="5" w:tplc="34090005" w:tentative="1">
+      <w:start w:val="1"/>
+      <w:numFmt w:val="bullet"/>
+      <w:lvlText w:val=""/>
+      <w:lvlJc w:val="left"/>
+      <w:pPr>
+        <w:ind w:left="4400" w:hanging="360"/>
+      </w:pPr>
+      <w:rPr>
+        <w:rFonts w:ascii="Wingdings" w:hAnsi="Wingdings" w:hint="default"/>
+      </w:rPr>
+    </w:lvl>
+    <w:lvl w:ilvl="6" w:tplc="34090001" w:tentative="1">
+      <w:start w:val="1"/>
+      <w:numFmt w:val="bullet"/>
+      <w:lvlText w:val=""/>
+      <w:lvlJc w:val="left"/>
+      <w:pPr>
+        <w:ind w:left="5120" w:hanging="360"/>
+      </w:pPr>
+      <w:rPr>
+        <w:rFonts w:ascii="Symbol" w:hAnsi="Symbol" w:hint="default"/>
+      </w:rPr>
+    </w:lvl>
+    <w:lvl w:ilvl="7" w:tplc="34090003" w:tentative="1">
+      <w:start w:val="1"/>
+      <w:numFmt w:val="bullet"/>
+      <w:lvlText w:val="o"/>
+      <w:lvlJc w:val="left"/>
+      <w:pPr>
+        <w:ind w:left="5840" w:hanging="360"/>
+      </w:pPr>
+      <w:rPr>
+        <w:rFonts w:ascii="Courier New" w:hAnsi="Courier New" w:cs="Courier New" w:hint="default"/>
+      </w:rPr>
+    </w:lvl>
+    <w:lvl w:ilvl="8" w:tplc="34090005" w:tentative="1">
+      <w:start w:val="1"/>
+      <w:numFmt w:val="bullet"/>
+      <w:lvlText w:val=""/>
+      <w:lvlJc w:val="left"/>
+      <w:pPr>
+        <w:ind w:left="6560" w:hanging="360"/>
+      </w:pPr>
+      <w:rPr>
+        <w:rFonts w:ascii="Wingdings" w:hAnsi="Wingdings" w:hint="default"/>
+      </w:rPr>
+    </w:lvl>
+  </w:abstractNum>
+  <w:abstractNum w:abstractNumId="1" w15:restartNumberingAfterBreak="0">
     <w:nsid w:val="65676E42"/>
     <w:multiLevelType w:val="hybridMultilevel"/>
     <w:tmpl w:val="491060EE"/>
@@ -2054,7 +2173,7 @@
       </w:rPr>
     </w:lvl>
   </w:abstractNum>
-  <w:abstractNum w:abstractNumId="1" w15:restartNumberingAfterBreak="0">
+  <w:abstractNum w:abstractNumId="2" w15:restartNumberingAfterBreak="0">
     <w:nsid w:val="7CF47E5C"/>
     <w:multiLevelType w:val="hybridMultilevel"/>
     <w:tmpl w:val="A342CD5C"/>
@@ -2141,12 +2260,15 @@
     </w:lvl>
   </w:abstractNum>
   <w:num w:numId="1">
-    <w:abstractNumId w:val="1"/>
+    <w:abstractNumId w:val="2"/>
     <w:lvlOverride w:ilvl="0">
       <w:startOverride w:val="1"/>
     </w:lvlOverride>
   </w:num>
   <w:num w:numId="2">
+    <w:abstractNumId w:val="1"/>
+  </w:num>
+  <w:num w:numId="3">
     <w:abstractNumId w:val="0"/>
   </w:num>
 </w:numbering>
@@ -3048,4 +3170,16 @@
     </a:ext>
   </a:extLst>
 </a:theme>
+</file>
+
+<file path=customXml/item1.xml><?xml version="1.0" encoding="utf-8"?>
+<b:Sources xmlns:b="http://schemas.openxmlformats.org/officeDocument/2006/bibliography" xmlns="http://schemas.openxmlformats.org/officeDocument/2006/bibliography" SelectedStyle="\APASixthEditionOfficeOnline.xsl" StyleName="APA" Version="6"/>
+</file>
+
+<file path=customXml/itemProps1.xml><?xml version="1.0" encoding="utf-8"?>
+<ds:datastoreItem xmlns:ds="http://schemas.openxmlformats.org/officeDocument/2006/customXml" ds:itemID="{24FECB82-E4D8-48F2-AD5B-D0CCDF4D9185}">
+  <ds:schemaRefs>
+    <ds:schemaRef ds:uri="http://schemas.openxmlformats.org/officeDocument/2006/bibliography"/>
+  </ds:schemaRefs>
+</ds:datastoreItem>
 </file>
</xml_diff>

<commit_message>
feat: refresh portfolio visuals and synchronize resumes
</commit_message>
<xml_diff>
--- a/public/documents/CV_Patrick_Gonzaga.docx
+++ b/public/documents/CV_Patrick_Gonzaga.docx
@@ -414,7 +414,7 @@
                 <w:rFonts w:ascii="Calibri" w:eastAsia="Calibri" w:hAnsi="Calibri" w:cs="Calibri"/>
                 <w:color w:val="E2E8EE"/>
               </w:rPr>
-              <w:t>Cursor, Gemini</w:t>
+              <w:t>Claude / Claude Code, MCP, OpenClaw, Cursor, Gemini</w:t>
             </w:r>
           </w:p>
           <w:p>
@@ -478,7 +478,7 @@
                 <w:rFonts w:ascii="Calibri" w:eastAsia="Calibri" w:hAnsi="Calibri" w:cs="Calibri"/>
                 <w:color w:val="E2E8EE"/>
               </w:rPr>
-              <w:t>N8n, Zapier</w:t>
+              <w:t>n8n, Node.js, Google OAuth / Drive API, Docker</w:t>
             </w:r>
           </w:p>
         </w:tc>
@@ -556,7 +556,7 @@
                       <w:rFonts w:ascii="Calibri" w:eastAsia="Calibri" w:hAnsi="Calibri" w:cs="Calibri"/>
                       <w:color w:val="2C2C2C"/>
                     </w:rPr>
-                    <w:t>Senior Software Engineer with 2 decades of software development experience, including 5+ years specializing in C#/.NET and Azure. Hands-on experience designing and delivering cloud-native, event-driven platforms using Azure PaaS, SQL, CI/CD, and infrastructure as code. Strong across the full lifecycle, from architecture and development to production support and continuous improvement.</w:t>
+                    <w:t xml:space="preserve">Software engineer with 2 decades of experience across software development, enterprise applications, databases, integrations and IT systems, with 5+ years of C# / modern .NET and 15+ years of VB.NET enterprise experience.</w:t>
                   </w:r>
                 </w:p>
               </w:tc>
@@ -583,6 +583,267 @@
           </w:p>
           <w:p>
             <w:pPr>
+              <w:keepNext/>
+              <w:tabs>
+                <w:tab w:val="right" w:pos="8040"/>
+              </w:tabs>
+              <w:spacing w:before="180" w:after="50"/>
+            </w:pPr>
+            <w:r>
+              <w:rPr>
+                <w:rFonts w:ascii="Calibri" w:eastAsia="Calibri" w:hAnsi="Calibri" w:cs="Calibri"/>
+                <w:b/>
+                <w:bCs/>
+                <w:color w:val="24344A"/>
+                <w:sz w:val="24"/>
+                <w:szCs w:val="24"/>
+              </w:rPr>
+              <w:t>Automation &amp; Integration Developer (Freelance)</w:t>
+            </w:r>
+            <w:r>
+              <w:rPr>
+                <w:rFonts w:ascii="Calibri" w:eastAsia="Calibri" w:hAnsi="Calibri" w:cs="Calibri"/>
+                <w:color w:val="6B7280"/>
+              </w:rPr>
+              <w:tab/>
+              <w:t>Sep 2026 – Present</w:t>
+            </w:r>
+          </w:p>
+          <w:p>
+            <w:pPr>
+              <w:keepNext/>
+              <w:spacing w:after="100"/>
+              <w:rPr>
+                <w:rFonts w:ascii="Calibri" w:eastAsia="Calibri" w:hAnsi="Calibri" w:cs="Calibri"/>
+                <w:b/>
+                <w:bCs/>
+                <w:color w:val="1E7F76"/>
+                <w:sz w:val="22"/>
+                <w:szCs w:val="22"/>
+              </w:rPr>
+            </w:pPr>
+            <w:r>
+              <w:rPr>
+                <w:rFonts w:ascii="Calibri" w:eastAsia="Calibri" w:hAnsi="Calibri" w:cs="Calibri"/>
+                <w:b/>
+                <w:bCs/>
+                <w:color w:val="1E7F76"/>
+                <w:sz w:val="22"/>
+                <w:szCs w:val="22"/>
+              </w:rPr>
+              <w:t xml:space="preserve">Australian IT services firm | Remote</w:t>
+            </w:r>
+          </w:p>
+          <w:p>
+            <w:pPr>
+              <w:keepNext/>
+              <w:spacing w:after="100"/>
+              <w:rPr>
+                <w:rFonts w:ascii="Calibri" w:eastAsia="Calibri" w:hAnsi="Calibri" w:cs="Calibri"/>
+                <w:b/>
+                <w:bCs/>
+                <w:color w:val="1E7F76"/>
+                <w:sz w:val="22"/>
+                <w:szCs w:val="22"/>
+              </w:rPr>
+            </w:pPr>
+            <w:r>
+              <w:rPr>
+                <w:rFonts w:ascii="Calibri" w:eastAsia="Calibri" w:hAnsi="Calibri" w:cs="Calibri"/>
+                <w:b w:val="0"/>
+                <w:bCs/>
+                <w:color w:val="6B7280"/>
+                <w:sz w:val="18"/>
+                <w:szCs w:val="22"/>
+                <w:i w:val="1"/>
+              </w:rPr>
+              <w:t xml:space="preserve">Client engagements under NDA</w:t>
+            </w:r>
+          </w:p>
+          <w:p>
+            <w:pPr>
+              <w:keepLines/>
+              <w:spacing w:after="70"/>
+              <w:ind w:left="280" w:hanging="200"/>
+            </w:pPr>
+            <w:r>
+              <w:rPr>
+                <w:rFonts w:ascii="Calibri" w:eastAsia="Calibri" w:hAnsi="Calibri" w:cs="Calibri"/>
+                <w:color w:val="2C2C2C"/>
+              </w:rPr>
+              <w:t xml:space="preserve">• Build AI knowledge platforms, document ingestion and synchronization pipelines, MCP integrations and automation workflows; operate and troubleshoot OpenClaw-based agents.</w:t>
+            </w:r>
+            <w:proofErr w:type="spellStart"/>
+            <w:r>
+              <w:rPr>
+                <w:rFonts w:ascii="Calibri" w:eastAsia="Calibri" w:hAnsi="Calibri" w:cs="Calibri"/>
+                <w:color w:val="2C2C2C"/>
+              </w:rPr>
+              <w:t/>
+            </w:r>
+            <w:proofErr w:type="spellEnd"/>
+            <w:r>
+              <w:rPr>
+                <w:rFonts w:ascii="Calibri" w:eastAsia="Calibri" w:hAnsi="Calibri" w:cs="Calibri"/>
+                <w:color w:val="2C2C2C"/>
+              </w:rPr>
+              <w:t/>
+            </w:r>
+          </w:p>
+          <w:p>
+            <w:pPr>
+              <w:keepLines/>
+              <w:spacing w:after="70"/>
+              <w:ind w:left="280" w:hanging="200"/>
+            </w:pPr>
+            <w:r>
+              <w:rPr>
+                <w:rFonts w:ascii="Calibri" w:eastAsia="Calibri" w:hAnsi="Calibri" w:cs="Calibri"/>
+                <w:color w:val="2C2C2C"/>
+              </w:rPr>
+              <w:t xml:space="preserve">• Deliver secure cloud deployments, infrastructure as code and CI/CD, with access controls, secrets management, backups, automated tests and release rollback.</w:t>
+            </w:r>
+            <w:proofErr w:type="spellStart"/>
+            <w:r>
+              <w:rPr>
+                <w:rFonts w:ascii="Calibri" w:eastAsia="Calibri" w:hAnsi="Calibri" w:cs="Calibri"/>
+                <w:color w:val="2C2C2C"/>
+              </w:rPr>
+              <w:t/>
+            </w:r>
+            <w:proofErr w:type="spellEnd"/>
+            <w:r>
+              <w:rPr>
+                <w:rFonts w:ascii="Calibri" w:eastAsia="Calibri" w:hAnsi="Calibri" w:cs="Calibri"/>
+                <w:color w:val="2C2C2C"/>
+              </w:rPr>
+              <w:t/>
+            </w:r>
+          </w:p>
+          <w:p>
+            <w:pPr>
+              <w:keepLines/>
+              <w:spacing w:after="70"/>
+              <w:ind w:left="280" w:hanging="200"/>
+            </w:pPr>
+            <w:r>
+              <w:rPr>
+                <w:rFonts w:ascii="Calibri" w:eastAsia="Calibri" w:hAnsi="Calibri" w:cs="Calibri"/>
+                <w:color w:val="2C2C2C"/>
+              </w:rPr>
+              <w:t xml:space="preserve">• Investigate and resolve web application and integration issues, implement features and regression tests, review changes and verify production releases.</w:t>
+            </w:r>
+            <w:proofErr w:type="spellStart"/>
+            <w:r>
+              <w:rPr>
+                <w:rFonts w:ascii="Calibri" w:eastAsia="Calibri" w:hAnsi="Calibri" w:cs="Calibri"/>
+                <w:color w:val="2C2C2C"/>
+              </w:rPr>
+              <w:t/>
+            </w:r>
+            <w:proofErr w:type="spellEnd"/>
+            <w:r>
+              <w:rPr>
+                <w:rFonts w:ascii="Calibri" w:eastAsia="Calibri" w:hAnsi="Calibri" w:cs="Calibri"/>
+                <w:color w:val="2C2C2C"/>
+              </w:rPr>
+              <w:t/>
+            </w:r>
+          </w:p>
+          <w:p>
+            <w:pPr>
+              <w:keepLines/>
+              <w:spacing w:after="70"/>
+              <w:ind w:left="280" w:hanging="200"/>
+            </w:pPr>
+            <w:r>
+              <w:rPr>
+                <w:rFonts w:ascii="Calibri" w:eastAsia="Calibri" w:hAnsi="Calibri" w:cs="Calibri"/>
+                <w:color w:val="2C2C2C"/>
+              </w:rPr>
+              <w:t xml:space="preserve">• Translate business processes into scopes, estimates and delivery plans; produce SOPs, technical guides and runbooks, and support stakeholder sessions and remote setup.</w:t>
+            </w:r>
+            <w:proofErr w:type="spellStart"/>
+            <w:r>
+              <w:rPr>
+                <w:rFonts w:ascii="Calibri" w:eastAsia="Calibri" w:hAnsi="Calibri" w:cs="Calibri"/>
+                <w:color w:val="2C2C2C"/>
+              </w:rPr>
+              <w:t/>
+            </w:r>
+            <w:proofErr w:type="spellEnd"/>
+            <w:r>
+              <w:rPr>
+                <w:rFonts w:ascii="Calibri" w:eastAsia="Calibri" w:hAnsi="Calibri" w:cs="Calibri"/>
+                <w:color w:val="2C2C2C"/>
+              </w:rPr>
+              <w:t/>
+            </w:r>
+          </w:p>
+          <w:p>
+            <w:pPr>
+              <w:keepLines/>
+              <w:pBdr>
+                <w:left w:val="single" w:sz="12" w:space="6" w:color="1E7F76"/>
+              </w:pBdr>
+              <w:shd w:val="clear" w:color="auto" w:fill="EFF6F5"/>
+              <w:spacing w:before="100" w:after="140" w:line="259" w:lineRule="auto"/>
+              <w:ind w:left="140" w:right="100"/>
+            </w:pPr>
+            <w:r>
+              <w:rPr>
+                <w:rFonts w:ascii="Calibri" w:hAnsi="Calibri"/>
+                <w:b/>
+                <w:color w:val="1E7F76"/>
+                <w:sz w:val="18"/>
+              </w:rPr>
+              <w:t xml:space="preserve">Technologies: </w:t>
+            </w:r>
+            <w:r>
+              <w:rPr>
+                <w:rFonts w:ascii="Calibri" w:hAnsi="Calibri"/>
+                <w:color w:val="344454"/>
+                <w:sz w:val="18"/>
+              </w:rPr>
+              <w:t>Node.js, MCP, Claude / Claude Code, OpenClaw, n8n, Docker, Linux, Azure (Key Vault, Bicep, NSG, Backup, CLI), Google OAuth / Drive API, rclone, Markdown / Obsidian, Caddy, systemd, GitHub Actions, Git.</w:t>
+            </w:r>
+            <w:proofErr w:type="spellStart"/>
+            <w:r>
+              <w:rPr>
+                <w:rFonts w:ascii="Calibri" w:hAnsi="Calibri"/>
+                <w:color w:val="344454"/>
+                <w:sz w:val="18"/>
+              </w:rPr>
+            </w:r>
+            <w:proofErr w:type="spellEnd"/>
+            <w:r>
+              <w:rPr>
+                <w:rFonts w:ascii="Calibri" w:hAnsi="Calibri"/>
+                <w:color w:val="344454"/>
+                <w:sz w:val="18"/>
+              </w:rPr>
+            </w:r>
+          </w:p>
+          <w:p>
+            <w:pPr>
+              <w:keepNext/>
+              <w:tabs>
+                <w:tab w:val="right" w:pos="8040"/>
+              </w:tabs>
+              <w:spacing w:before="180" w:after="50"/>
+              <w:rPr>
+                <w:rFonts w:ascii="Calibri" w:eastAsia="Calibri" w:hAnsi="Calibri" w:cs="Calibri"/>
+                <w:b/>
+                <w:bCs/>
+                <w:color w:val="24344A"/>
+                <w:sz w:val="24"/>
+                <w:szCs w:val="24"/>
+              </w:rPr>
+            </w:pPr>
+          </w:p>
+          <w:p>
+            <w:pPr>
+              <w:keepNext/>
               <w:tabs>
                 <w:tab w:val="right" w:pos="8040"/>
               </w:tabs>
@@ -661,6 +922,7 @@
           </w:p>
           <w:p>
             <w:pPr>
+              <w:keepNext/>
               <w:spacing w:after="100"/>
               <w:rPr>
                 <w:rFonts w:ascii="Calibri" w:eastAsia="Calibri" w:hAnsi="Calibri" w:cs="Calibri"/>
@@ -677,6 +939,7 @@
           </w:p>
           <w:p>
             <w:pPr>
+              <w:keepLines/>
               <w:spacing w:after="70"/>
               <w:ind w:left="280" w:hanging="200"/>
             </w:pPr>
@@ -685,7 +948,7 @@
                 <w:rFonts w:ascii="Calibri" w:eastAsia="Calibri" w:hAnsi="Calibri" w:cs="Calibri"/>
                 <w:color w:val="2C2C2C"/>
               </w:rPr>
-              <w:t xml:space="preserve">• Built and maintained the Deals and </w:t>
+              <w:t xml:space="preserve">• Built and maintained C# / .NET / ASP.NET Core APIs and EF Core data access for Deals and WikiCamps, contributing shared services across sites, forums, accounts, trips and media.</w:t>
             </w:r>
             <w:proofErr w:type="spellStart"/>
             <w:r>
@@ -693,7 +956,7 @@
                 <w:rFonts w:ascii="Calibri" w:eastAsia="Calibri" w:hAnsi="Calibri" w:cs="Calibri"/>
                 <w:color w:val="2C2C2C"/>
               </w:rPr>
-              <w:t>WikiCamps</w:t>
+              <w:t/>
             </w:r>
             <w:proofErr w:type="spellEnd"/>
             <w:r>
@@ -701,11 +964,12 @@
                 <w:rFonts w:ascii="Calibri" w:eastAsia="Calibri" w:hAnsi="Calibri" w:cs="Calibri"/>
                 <w:color w:val="2C2C2C"/>
               </w:rPr>
-              <w:t xml:space="preserve"> domain, focusing on RESTful API implementation and EF Core data access for reliable, scalable platform integration.</w:t>
-            </w:r>
-          </w:p>
-          <w:p>
-            <w:pPr>
+              <w:t/>
+            </w:r>
+          </w:p>
+          <w:p>
+            <w:pPr>
+              <w:keepLines/>
               <w:spacing w:after="70"/>
               <w:ind w:left="280" w:hanging="200"/>
             </w:pPr>
@@ -714,7 +978,7 @@
                 <w:rFonts w:ascii="Calibri" w:eastAsia="Calibri" w:hAnsi="Calibri" w:cs="Calibri"/>
                 <w:color w:val="2C2C2C"/>
               </w:rPr>
-              <w:t xml:space="preserve">• Contributed to a microservices-based architecture for the </w:t>
+              <w:t xml:space="preserve">• Delivered event-driven workflows with Azure Service Bus, Functions, Redis, Blob Storage, Key Vault and Application Insights; integrated BookEasy, OSRM with Polly, and Azure AI Search.</w:t>
             </w:r>
             <w:proofErr w:type="spellStart"/>
             <w:r>
@@ -722,7 +986,7 @@
                 <w:rFonts w:ascii="Calibri" w:eastAsia="Calibri" w:hAnsi="Calibri" w:cs="Calibri"/>
                 <w:color w:val="2C2C2C"/>
               </w:rPr>
-              <w:t>WikiCamps</w:t>
+              <w:t/>
             </w:r>
             <w:proofErr w:type="spellEnd"/>
             <w:r>
@@ -730,11 +994,12 @@
                 <w:rFonts w:ascii="Calibri" w:eastAsia="Calibri" w:hAnsi="Calibri" w:cs="Calibri"/>
                 <w:color w:val="2C2C2C"/>
               </w:rPr>
-              <w:t xml:space="preserve"> platform, delivering shared services across sites, forums, accounts, trips, and media modules.</w:t>
-            </w:r>
-          </w:p>
-          <w:p>
-            <w:pPr>
+              <w:t/>
+            </w:r>
+          </w:p>
+          <w:p>
+            <w:pPr>
+              <w:keepLines/>
               <w:spacing w:after="70"/>
               <w:ind w:left="280" w:hanging="200"/>
             </w:pPr>
@@ -743,7 +1008,7 @@
                 <w:rFonts w:ascii="Calibri" w:eastAsia="Calibri" w:hAnsi="Calibri" w:cs="Calibri"/>
                 <w:color w:val="2C2C2C"/>
               </w:rPr>
-              <w:t xml:space="preserve">• Took ownership of the Admin Portal (Retool) for deals, bookings, and </w:t>
+              <w:t xml:space="preserve">• Owned the Retool Admin Portal, including pages, resources, SQL queries and multi-environment configuration for deals, bookings and WikiCamps.</w:t>
             </w:r>
             <w:proofErr w:type="spellStart"/>
             <w:r>
@@ -751,7 +1016,7 @@
                 <w:rFonts w:ascii="Calibri" w:eastAsia="Calibri" w:hAnsi="Calibri" w:cs="Calibri"/>
                 <w:color w:val="2C2C2C"/>
               </w:rPr>
-              <w:t>WikiCamps</w:t>
+              <w:t/>
             </w:r>
             <w:proofErr w:type="spellEnd"/>
             <w:r>
@@ -759,11 +1024,12 @@
                 <w:rFonts w:ascii="Calibri" w:eastAsia="Calibri" w:hAnsi="Calibri" w:cs="Calibri"/>
                 <w:color w:val="2C2C2C"/>
               </w:rPr>
-              <w:t xml:space="preserve"> — including pages, resource/query configuration, and multi-environment setup.</w:t>
-            </w:r>
-          </w:p>
-          <w:p>
-            <w:pPr>
+              <w:t/>
+            </w:r>
+          </w:p>
+          <w:p>
+            <w:pPr>
+              <w:keepLines/>
               <w:spacing w:after="70"/>
               <w:ind w:left="280" w:hanging="200"/>
             </w:pPr>
@@ -772,20 +1038,7 @@
                 <w:rFonts w:ascii="Calibri" w:eastAsia="Calibri" w:hAnsi="Calibri" w:cs="Calibri"/>
                 <w:color w:val="2C2C2C"/>
               </w:rPr>
-              <w:t>• Worked extensively with Azure services: Key Vault, Application Insights, Redis Cache, Blob Storage, Service Bus (message handlers), and Azure Functions (media resizing, scheduled jobs, offline builder).</w:t>
-            </w:r>
-          </w:p>
-          <w:p>
-            <w:pPr>
-              <w:spacing w:after="70"/>
-              <w:ind w:left="280" w:hanging="200"/>
-            </w:pPr>
-            <w:r>
-              <w:rPr>
-                <w:rFonts w:ascii="Calibri" w:eastAsia="Calibri" w:hAnsi="Calibri" w:cs="Calibri"/>
-                <w:color w:val="2C2C2C"/>
-              </w:rPr>
-              <w:t xml:space="preserve">• Integrated external and internal services such as </w:t>
+              <w:t xml:space="preserve">• Enforced SonarQube code quality, security and coverage standards; used Cursor and MCP for read-only Azure / SQL context, reviewing and validating changes before release.</w:t>
             </w:r>
             <w:proofErr w:type="spellStart"/>
             <w:r>
@@ -793,7 +1046,7 @@
                 <w:rFonts w:ascii="Calibri" w:eastAsia="Calibri" w:hAnsi="Calibri" w:cs="Calibri"/>
                 <w:color w:val="2C2C2C"/>
               </w:rPr>
-              <w:t>BookEasy</w:t>
+              <w:t/>
             </w:r>
             <w:proofErr w:type="spellEnd"/>
             <w:r>
@@ -801,68 +1054,45 @@
                 <w:rFonts w:ascii="Calibri" w:eastAsia="Calibri" w:hAnsi="Calibri" w:cs="Calibri"/>
                 <w:color w:val="2C2C2C"/>
               </w:rPr>
-              <w:t xml:space="preserve"> (bookings), OSRM (routing) with Polly resilience policies, and Azure AI Search for content indexing.</w:t>
-            </w:r>
-          </w:p>
-          <w:p>
-            <w:pPr>
-              <w:spacing w:after="70"/>
-              <w:ind w:left="280" w:hanging="200"/>
-              <w:rPr>
-                <w:rFonts w:ascii="Calibri" w:eastAsia="Calibri" w:hAnsi="Calibri" w:cs="Calibri"/>
-                <w:color w:val="2C2C2C"/>
-              </w:rPr>
-            </w:pPr>
-            <w:r>
-              <w:rPr>
-                <w:rFonts w:ascii="Calibri" w:eastAsia="Calibri" w:hAnsi="Calibri" w:cs="Calibri"/>
-                <w:color w:val="2C2C2C"/>
-              </w:rPr>
-              <w:t>• Used Cursor (repository-level rules, MCP for read-only Azure/SQL access) to support AI-assisted development; ensured all changes were reviewed and validated before merge or execution.</w:t>
-            </w:r>
-          </w:p>
-          <w:p>
-            <w:pPr>
-              <w:spacing w:after="70"/>
-              <w:ind w:left="280" w:hanging="200"/>
-              <w:rPr>
-                <w:rFonts w:ascii="Calibri" w:eastAsia="Calibri" w:hAnsi="Calibri" w:cs="Calibri"/>
-                <w:color w:val="2C2C2C"/>
-              </w:rPr>
-            </w:pPr>
-            <w:r>
-              <w:rPr>
-                <w:rFonts w:ascii="Calibri" w:eastAsia="Calibri" w:hAnsi="Calibri" w:cs="Calibri"/>
-                <w:color w:val="2C2C2C"/>
-              </w:rPr>
-              <w:t xml:space="preserve">• </w:t>
-            </w:r>
-            <w:r>
-              <w:rPr>
-                <w:rFonts w:ascii="Calibri" w:eastAsia="Calibri" w:hAnsi="Calibri" w:cs="Calibri"/>
-                <w:color w:val="2C2C2C"/>
-              </w:rPr>
-              <w:t>Enforced code quality and maintainability standards on the Deals backend using SonarQube static analysis, addressing code smells, vulnerabilities, and coverage gaps as part of the CI pipeline.</w:t>
-            </w:r>
-          </w:p>
-          <w:p>
-            <w:pPr>
-              <w:spacing w:after="70"/>
-              <w:ind w:left="280" w:hanging="200"/>
-              <w:rPr>
-                <w:rFonts w:ascii="Calibri" w:eastAsia="Calibri" w:hAnsi="Calibri" w:cs="Calibri"/>
-                <w:color w:val="2C2C2C"/>
-              </w:rPr>
-            </w:pPr>
-          </w:p>
-          <w:p>
-            <w:pPr>
+              <w:t/>
+            </w:r>
+          </w:p>
+          <w:p>
+            <w:pPr>
+              <w:keepLines/>
+              <w:pBdr>
+                <w:left w:val="single" w:sz="12" w:space="6" w:color="1E7F76"/>
+              </w:pBdr>
+              <w:shd w:val="clear" w:color="auto" w:fill="EFF6F5"/>
+              <w:spacing w:before="100" w:after="140" w:line="259" w:lineRule="auto"/>
+              <w:ind w:left="140" w:right="100"/>
+            </w:pPr>
+            <w:r>
+              <w:rPr>
+                <w:rFonts w:ascii="Calibri" w:hAnsi="Calibri"/>
+                <w:b/>
+                <w:color w:val="1E7F76"/>
+                <w:sz w:val="18"/>
+              </w:rPr>
+              <w:t xml:space="preserve">Technologies: </w:t>
+            </w:r>
+            <w:r>
+              <w:rPr>
+                <w:rFonts w:ascii="Calibri" w:hAnsi="Calibri"/>
+                <w:color w:val="344454"/>
+                <w:sz w:val="18"/>
+              </w:rPr>
+              <w:t>C#, .NET, ASP.NET Core, EF Core, REST APIs, Azure (Key Vault, Application Insights, Redis, Blob Storage, Service Bus, Functions, AI Search), SQL Server, Retool, Polly, SonarQube, Cursor, MCP.</w:t>
+            </w:r>
+          </w:p>
+          <w:p>
+            <w:pPr>
+              <w:keepNext/>
+              <w:pageBreakBefore/>
               <w:tabs>
                 <w:tab w:val="right" w:pos="8040"/>
               </w:tabs>
               <w:spacing w:before="120" w:after="30"/>
-            </w:pPr>
-            <w:r>
               <w:rPr>
                 <w:rFonts w:ascii="Calibri" w:eastAsia="Calibri" w:hAnsi="Calibri" w:cs="Calibri"/>
                 <w:b/>
@@ -873,6 +1103,28 @@
                 <w:sz w:val="22"/>
                 <w:szCs w:val="22"/>
               </w:rPr>
+            </w:pPr>
+          </w:p>
+          <w:p>
+            <w:pPr>
+              <w:keepNext/>
+              <w:pageBreakBefore/>
+              <w:tabs>
+                <w:tab w:val="right" w:pos="8040"/>
+              </w:tabs>
+              <w:spacing w:before="120" w:after="30"/>
+            </w:pPr>
+            <w:r>
+              <w:rPr>
+                <w:rFonts w:ascii="Calibri" w:eastAsia="Calibri" w:hAnsi="Calibri" w:cs="Calibri"/>
+                <w:b/>
+                <w:bCs/>
+                <w:i/>
+                <w:iCs/>
+                <w:color w:val="1E7F76"/>
+                <w:sz w:val="22"/>
+                <w:szCs w:val="22"/>
+              </w:rPr>
               <w:t>.</w:t>
             </w:r>
             <w:r>
@@ -897,6 +1149,7 @@
           </w:p>
           <w:p>
             <w:pPr>
+              <w:keepNext/>
               <w:spacing w:after="100"/>
             </w:pPr>
             <w:r>
@@ -966,6 +1219,7 @@
           </w:p>
           <w:p>
             <w:pPr>
+              <w:keepLines/>
               <w:spacing w:after="70"/>
               <w:ind w:left="280" w:hanging="200"/>
             </w:pPr>
@@ -974,11 +1228,12 @@
                 <w:rFonts w:ascii="Calibri" w:eastAsia="Calibri" w:hAnsi="Calibri" w:cs="Calibri"/>
                 <w:color w:val="2C2C2C"/>
               </w:rPr>
-              <w:t>• Collaborated in the development of a highly scalable web application architecture utilizing AWS S3 and SQS for efficient and reliable storage and messaging solutions.</w:t>
-            </w:r>
-          </w:p>
-          <w:p>
-            <w:pPr>
+              <w:t xml:space="preserve">• Built, maintained and refactored C# / .NET energy applications, using AWS S3 and SQS for scalable storage and reliable asynchronous messaging.</w:t>
+            </w:r>
+          </w:p>
+          <w:p>
+            <w:pPr>
+              <w:keepLines/>
               <w:spacing w:after="70"/>
               <w:ind w:left="280" w:hanging="200"/>
             </w:pPr>
@@ -987,44 +1242,26 @@
                 <w:rFonts w:ascii="Calibri" w:eastAsia="Calibri" w:hAnsi="Calibri" w:cs="Calibri"/>
                 <w:color w:val="2C2C2C"/>
               </w:rPr>
-              <w:t xml:space="preserve">• Responsible for the design, development, refactoring, and maintenance of the </w:t>
-            </w:r>
-            <w:proofErr w:type="spellStart"/>
-            <w:r>
-              <w:rPr>
-                <w:rFonts w:ascii="Calibri" w:eastAsia="Calibri" w:hAnsi="Calibri" w:cs="Calibri"/>
-                <w:color w:val="2C2C2C"/>
-              </w:rPr>
-              <w:t>Optimatech</w:t>
-            </w:r>
-            <w:proofErr w:type="spellEnd"/>
-            <w:r>
-              <w:rPr>
-                <w:rFonts w:ascii="Calibri" w:eastAsia="Calibri" w:hAnsi="Calibri" w:cs="Calibri"/>
-                <w:color w:val="2C2C2C"/>
-              </w:rPr>
-              <w:t xml:space="preserve"> application, implementing efficient and reliable best software practices.</w:t>
-            </w:r>
-          </w:p>
-          <w:p>
-            <w:pPr>
+              <w:t xml:space="preserve">• Applied Clean Architecture, code reviews and Snyk security scanning; automated validation maintained 99% meter data accuracy.</w:t>
+            </w:r>
+          </w:p>
+          <w:p>
+            <w:pPr>
+              <w:keepLines/>
               <w:spacing w:after="70"/>
               <w:ind w:left="280" w:hanging="200"/>
-              <w:rPr>
-                <w:rFonts w:ascii="Calibri" w:eastAsia="Calibri" w:hAnsi="Calibri" w:cs="Calibri"/>
-                <w:color w:val="2C2C2C"/>
-              </w:rPr>
-            </w:pPr>
-            <w:r>
-              <w:rPr>
-                <w:rFonts w:ascii="Calibri" w:eastAsia="Calibri" w:hAnsi="Calibri" w:cs="Calibri"/>
-                <w:color w:val="2C2C2C"/>
-              </w:rPr>
-              <w:t>• Participated in code review sessions, enforcing coding standards and maintainability.</w:t>
-            </w:r>
-          </w:p>
-          <w:p>
-            <w:pPr>
+            </w:pPr>
+            <w:r>
+              <w:rPr>
+                <w:rFonts w:ascii="Calibri" w:eastAsia="Calibri" w:hAnsi="Calibri" w:cs="Calibri"/>
+                <w:color w:val="2C2C2C"/>
+              </w:rPr>
+              <w:t xml:space="preserve">• Delivered releases across Test, UAT and Production using Buildkite CI/CD with minimal downtime.</w:t>
+            </w:r>
+          </w:p>
+          <w:p>
+            <w:pPr>
+              <w:keepLines/>
               <w:spacing w:after="70"/>
               <w:ind w:left="280" w:hanging="200"/>
             </w:pPr>
@@ -1033,89 +1270,40 @@
                 <w:rFonts w:ascii="Calibri" w:eastAsia="Calibri" w:hAnsi="Calibri" w:cs="Calibri"/>
                 <w:color w:val="2C2C2C"/>
               </w:rPr>
-              <w:t xml:space="preserve">• </w:t>
-            </w:r>
-            <w:r>
-              <w:rPr>
-                <w:rFonts w:ascii="Calibri" w:eastAsia="Calibri" w:hAnsi="Calibri" w:cs="Calibri"/>
-                <w:color w:val="2C2C2C"/>
-              </w:rPr>
-              <w:t xml:space="preserve">Utilized </w:t>
-            </w:r>
-            <w:proofErr w:type="spellStart"/>
-            <w:r>
-              <w:rPr>
-                <w:rFonts w:ascii="Calibri" w:eastAsia="Calibri" w:hAnsi="Calibri" w:cs="Calibri"/>
-                <w:color w:val="2C2C2C"/>
-              </w:rPr>
-              <w:t>Snyk</w:t>
-            </w:r>
-            <w:proofErr w:type="spellEnd"/>
-            <w:r>
-              <w:rPr>
-                <w:rFonts w:ascii="Calibri" w:eastAsia="Calibri" w:hAnsi="Calibri" w:cs="Calibri"/>
-                <w:color w:val="2C2C2C"/>
-              </w:rPr>
-              <w:t xml:space="preserve"> for automated vulnerability and dependency security scanning as part of the development workflow</w:t>
-            </w:r>
-          </w:p>
-          <w:p>
-            <w:pPr>
-              <w:spacing w:after="70"/>
-              <w:ind w:left="280" w:hanging="200"/>
-            </w:pPr>
-            <w:r>
-              <w:rPr>
-                <w:rFonts w:ascii="Calibri" w:eastAsia="Calibri" w:hAnsi="Calibri" w:cs="Calibri"/>
-                <w:color w:val="2C2C2C"/>
-              </w:rPr>
-              <w:t>• Created and maintained top-notch functional and technical documentation using Confluence, resulting in a 50% improvement in knowledge sharing and software development and troubleshooting efficiency.</w:t>
-            </w:r>
-          </w:p>
-          <w:p>
-            <w:pPr>
-              <w:spacing w:after="70"/>
-              <w:ind w:left="280" w:hanging="200"/>
-            </w:pPr>
-            <w:r>
-              <w:rPr>
-                <w:rFonts w:ascii="Calibri" w:eastAsia="Calibri" w:hAnsi="Calibri" w:cs="Calibri"/>
-                <w:color w:val="2C2C2C"/>
-              </w:rPr>
-              <w:t xml:space="preserve">• Successfully deployed code to Test, UAT, and production environments using </w:t>
-            </w:r>
-            <w:proofErr w:type="spellStart"/>
-            <w:r>
-              <w:rPr>
-                <w:rFonts w:ascii="Calibri" w:eastAsia="Calibri" w:hAnsi="Calibri" w:cs="Calibri"/>
-                <w:color w:val="2C2C2C"/>
-              </w:rPr>
-              <w:t>Buildkite</w:t>
-            </w:r>
-            <w:proofErr w:type="spellEnd"/>
-            <w:r>
-              <w:rPr>
-                <w:rFonts w:ascii="Calibri" w:eastAsia="Calibri" w:hAnsi="Calibri" w:cs="Calibri"/>
-                <w:color w:val="2C2C2C"/>
-              </w:rPr>
-              <w:t>, ensuring minimal downtime and efficient releases.</w:t>
-            </w:r>
-          </w:p>
-          <w:p>
-            <w:pPr>
-              <w:spacing w:after="70"/>
-              <w:ind w:left="280" w:hanging="200"/>
-            </w:pPr>
-            <w:r>
-              <w:rPr>
-                <w:rFonts w:ascii="Calibri" w:eastAsia="Calibri" w:hAnsi="Calibri" w:cs="Calibri"/>
-                <w:color w:val="2C2C2C"/>
-              </w:rPr>
-              <w:t>• Oversaw the accuracy of meter data, ensuring a 99% data quality rate.</w:t>
-            </w:r>
-          </w:p>
-          <w:p>
-            <w:pPr>
+              <w:t xml:space="preserve">• Created functional and technical documentation in Confluence, improving knowledge sharing and troubleshooting efficiency by 50%.</w:t>
+            </w:r>
+          </w:p>
+          <w:p>
+            <w:pPr>
+              <w:keepLines/>
+              <w:pBdr>
+                <w:left w:val="single" w:sz="12" w:space="6" w:color="1E7F76"/>
+              </w:pBdr>
+              <w:shd w:val="clear" w:color="auto" w:fill="EFF6F5"/>
+              <w:spacing w:before="100" w:after="140" w:line="259" w:lineRule="auto"/>
+              <w:ind w:left="140" w:right="100"/>
+            </w:pPr>
+            <w:r>
+              <w:rPr>
+                <w:rFonts w:ascii="Calibri" w:hAnsi="Calibri"/>
+                <w:b/>
+                <w:color w:val="1E7F76"/>
+                <w:sz w:val="18"/>
+              </w:rPr>
+              <w:t xml:space="preserve">Technologies: </w:t>
+            </w:r>
+            <w:r>
+              <w:rPr>
+                <w:rFonts w:ascii="Calibri" w:hAnsi="Calibri"/>
+                <w:color w:val="344454"/>
+                <w:sz w:val="18"/>
+              </w:rPr>
+              <w:t>C#, .NET, AWS S3, AWS SQS, Buildkite CI/CD, Snyk, Clean Architecture, Confluence.</w:t>
+            </w:r>
+          </w:p>
+          <w:p>
+            <w:pPr>
+              <w:keepNext/>
               <w:tabs>
                 <w:tab w:val="right" w:pos="8040"/>
               </w:tabs>
@@ -1132,10 +1320,13 @@
           </w:p>
           <w:p>
             <w:pPr>
+              <w:keepNext/>
               <w:tabs>
                 <w:tab w:val="right" w:pos="8040"/>
               </w:tabs>
               <w:spacing w:before="180" w:after="30"/>
+            </w:pPr>
+            <w:r>
               <w:rPr>
                 <w:rFonts w:ascii="Calibri" w:eastAsia="Calibri" w:hAnsi="Calibri" w:cs="Calibri"/>
                 <w:b/>
@@ -1144,16 +1335,139 @@
                 <w:sz w:val="24"/>
                 <w:szCs w:val="24"/>
               </w:rPr>
-            </w:pPr>
-          </w:p>
-          <w:p>
-            <w:pPr>
+              <w:t>Senior Engineer</w:t>
+            </w:r>
+            <w:r>
+              <w:rPr>
+                <w:rFonts w:ascii="Calibri" w:eastAsia="Calibri" w:hAnsi="Calibri" w:cs="Calibri"/>
+                <w:color w:val="6B7280"/>
+              </w:rPr>
+              <w:tab/>
+              <w:t>2011 – 2021</w:t>
+            </w:r>
+          </w:p>
+          <w:p>
+            <w:pPr>
+              <w:keepNext/>
+              <w:spacing w:after="100"/>
+            </w:pPr>
+            <w:r>
+              <w:rPr>
+                <w:rFonts w:ascii="Calibri" w:eastAsia="Calibri" w:hAnsi="Calibri" w:cs="Calibri"/>
+                <w:b/>
+                <w:bCs/>
+                <w:color w:val="1E7F76"/>
+                <w:sz w:val="22"/>
+                <w:szCs w:val="22"/>
+              </w:rPr>
+              <w:t>Renesas Semiconductor KL SDN BHD, Kuala Langat, Malaysia</w:t>
+            </w:r>
+          </w:p>
+          <w:p>
+            <w:pPr>
+              <w:keepLines/>
+              <w:spacing w:after="70"/>
+              <w:ind w:left="280" w:hanging="200"/>
+            </w:pPr>
+            <w:r>
+              <w:rPr>
+                <w:rFonts w:ascii="Calibri" w:eastAsia="Calibri" w:hAnsi="Calibri" w:cs="Calibri"/>
+                <w:color w:val="2C2C2C"/>
+              </w:rPr>
+              <w:t xml:space="preserve">• Served as a senior engineer managing and scaling 24/7 Manufacturing Execution Systems (MES) and enterprise IT applications across 100+ production, VMware, and Hyper-V servers.</w:t>
+            </w:r>
+          </w:p>
+          <w:p>
+            <w:pPr>
+              <w:keepLines/>
+              <w:spacing w:after="70"/>
+              <w:ind w:left="280" w:hanging="200"/>
+            </w:pPr>
+            <w:r>
+              <w:rPr>
+                <w:rFonts w:ascii="Calibri" w:eastAsia="Calibri" w:hAnsi="Calibri" w:cs="Calibri"/>
+                <w:color w:val="2C2C2C"/>
+              </w:rPr>
+              <w:t xml:space="preserve">• Engineered custom VB.NET, SQL Server, and Oracle solutions that boosted floor productivity by 75% and delivered &gt; MYR 1M in verified time-saving operational benefits.</w:t>
+            </w:r>
+          </w:p>
+          <w:p>
+            <w:pPr>
+              <w:keepLines/>
+              <w:spacing w:after="70"/>
+              <w:ind w:left="280" w:hanging="200"/>
+            </w:pPr>
+            <w:r>
+              <w:rPr>
+                <w:rFonts w:ascii="Calibri" w:eastAsia="Calibri" w:hAnsi="Calibri" w:cs="Calibri"/>
+                <w:color w:val="2C2C2C"/>
+              </w:rPr>
+              <w:t xml:space="preserve">• Architected the Electronic Lot Control Slip (e-LCS) and e-Counting Balance System, implementing poka-yoke validation to eliminate lot-mixing defects and save up to 800,000 scrapped component pieces.</w:t>
+            </w:r>
+          </w:p>
+          <w:p>
+            <w:pPr>
+              <w:keepLines/>
+              <w:spacing w:after="70"/>
+              <w:ind w:left="280" w:hanging="200"/>
+            </w:pPr>
+            <w:r>
+              <w:rPr>
+                <w:rFonts w:ascii="Calibri" w:eastAsia="Calibri" w:hAnsi="Calibri" w:cs="Calibri"/>
+                <w:color w:val="2C2C2C"/>
+              </w:rPr>
+              <w:t xml:space="preserve">• Integrated SAP with MES to fully automate material master registration and production planning runs, eliminating manual data entry cycles.</w:t>
+            </w:r>
+          </w:p>
+          <w:p>
+            <w:pPr>
+              <w:keepLines/>
+              <w:spacing w:after="70"/>
+              <w:ind w:left="280" w:hanging="200"/>
+            </w:pPr>
+            <w:r>
+              <w:rPr>
+                <w:rFonts w:ascii="Calibri" w:eastAsia="Calibri" w:hAnsi="Calibri" w:cs="Calibri"/>
+                <w:color w:val="2C2C2C"/>
+              </w:rPr>
+              <w:t xml:space="preserve">• Built internal RSKL Helpdesk ticketing system (VB.NET, ASP.NET, SQL Server) and real-time Spotfire manufacturing analytics dashboards for operational leadership.</w:t>
+            </w:r>
+          </w:p>
+          <w:p>
+            <w:pPr>
+              <w:keepLines/>
+              <w:pBdr>
+                <w:left w:val="single" w:sz="12" w:space="6" w:color="1E7F76"/>
+              </w:pBdr>
+              <w:shd w:val="clear" w:color="auto" w:fill="EFF6F5"/>
+              <w:spacing w:before="100" w:after="140" w:line="259" w:lineRule="auto"/>
+              <w:ind w:left="140" w:right="100"/>
+            </w:pPr>
+            <w:r>
+              <w:rPr>
+                <w:rFonts w:ascii="Calibri" w:hAnsi="Calibri"/>
+                <w:b/>
+                <w:color w:val="1E7F76"/>
+                <w:sz w:val="18"/>
+              </w:rPr>
+              <w:t xml:space="preserve">Technologies: </w:t>
+            </w:r>
+            <w:r>
+              <w:rPr>
+                <w:rFonts w:ascii="Calibri" w:hAnsi="Calibri"/>
+                <w:color w:val="344454"/>
+                <w:sz w:val="18"/>
+              </w:rPr>
+              <w:t>VB.NET, ASP.NET, SQL Server, Oracle, SAP, MES, TIBCO Spotfire, VMware, Hyper-V.</w:t>
+            </w:r>
+          </w:p>
+          <w:p>
+            <w:pPr>
+              <w:keepNext/>
               <w:tabs>
                 <w:tab w:val="right" w:pos="8040"/>
               </w:tabs>
               <w:spacing w:before="180" w:after="30"/>
-            </w:pPr>
-            <w:r>
               <w:rPr>
                 <w:rFonts w:ascii="Calibri" w:eastAsia="Calibri" w:hAnsi="Calibri" w:cs="Calibri"/>
                 <w:b/>
@@ -1162,112 +1476,11 @@
                 <w:sz w:val="24"/>
                 <w:szCs w:val="24"/>
               </w:rPr>
-              <w:lastRenderedPageBreak/>
-              <w:t>Senior Engineer</w:t>
-            </w:r>
-            <w:r>
-              <w:rPr>
-                <w:rFonts w:ascii="Calibri" w:eastAsia="Calibri" w:hAnsi="Calibri" w:cs="Calibri"/>
-                <w:color w:val="6B7280"/>
-              </w:rPr>
-              <w:tab/>
-              <w:t>2011 – 2021</w:t>
-            </w:r>
-          </w:p>
-          <w:p>
-            <w:pPr>
-              <w:spacing w:after="100"/>
-            </w:pPr>
-            <w:r>
-              <w:rPr>
-                <w:rFonts w:ascii="Calibri" w:eastAsia="Calibri" w:hAnsi="Calibri" w:cs="Calibri"/>
-                <w:b/>
-                <w:bCs/>
-                <w:color w:val="1E7F76"/>
-                <w:sz w:val="22"/>
-                <w:szCs w:val="22"/>
-              </w:rPr>
-              <w:t>Renesas Semiconductor KL SDN BHD, Kuala Langat, Malaysia</w:t>
-            </w:r>
-          </w:p>
-          <w:p>
-            <w:pPr>
-              <w:spacing w:after="70"/>
-              <w:ind w:left="280" w:hanging="200"/>
-            </w:pPr>
-            <w:r>
-              <w:rPr>
-                <w:rFonts w:ascii="Calibri" w:eastAsia="Calibri" w:hAnsi="Calibri" w:cs="Calibri"/>
-                <w:color w:val="2C2C2C"/>
-              </w:rPr>
-              <w:t>• Maintained 99% uptime for the Manufacturing Execution System (MES), ensuring reliable production operations.</w:t>
-            </w:r>
-          </w:p>
-          <w:p>
-            <w:pPr>
-              <w:spacing w:after="70"/>
-              <w:ind w:left="280" w:hanging="200"/>
-            </w:pPr>
-            <w:r>
-              <w:rPr>
-                <w:rFonts w:ascii="Calibri" w:eastAsia="Calibri" w:hAnsi="Calibri" w:cs="Calibri"/>
-                <w:color w:val="2C2C2C"/>
-              </w:rPr>
-              <w:t>• Designed and delivered automation solutions by analyzing production workflows, collaborating with users, and resolving system bottlenecks — increasing productivity by 75%, generating over MYR 1M in time savings, and implementing Poka-Yoke (mistake-proofing) processes.</w:t>
-            </w:r>
-          </w:p>
-          <w:p>
-            <w:pPr>
-              <w:spacing w:after="70"/>
-              <w:ind w:left="280" w:hanging="200"/>
-            </w:pPr>
-            <w:r>
-              <w:rPr>
-                <w:rFonts w:ascii="Calibri" w:eastAsia="Calibri" w:hAnsi="Calibri" w:cs="Calibri"/>
-                <w:color w:val="2C2C2C"/>
-              </w:rPr>
-              <w:t xml:space="preserve">• Administered over 100 servers running on physical, VMware, and Hyper-V infrastructure, </w:t>
-            </w:r>
-            <w:r>
-              <w:rPr>
-                <w:rFonts w:ascii="Calibri" w:eastAsia="Calibri" w:hAnsi="Calibri" w:cs="Calibri"/>
-                <w:color w:val="2C2C2C"/>
-              </w:rPr>
-              <w:t>including in-house and Japan-developed systems using Oracle and MS SQL databases</w:t>
-            </w:r>
-          </w:p>
-          <w:p>
-            <w:pPr>
-              <w:spacing w:after="70"/>
-              <w:ind w:left="280" w:hanging="200"/>
-            </w:pPr>
-            <w:r>
-              <w:rPr>
-                <w:rFonts w:ascii="Calibri" w:eastAsia="Calibri" w:hAnsi="Calibri" w:cs="Calibri"/>
-                <w:color w:val="2C2C2C"/>
-              </w:rPr>
-              <w:t>• Developed system integrations between SAP and MES, automating material master registration and production planning processes.</w:t>
-            </w:r>
-          </w:p>
-          <w:p>
-            <w:pPr>
-              <w:spacing w:after="70"/>
-              <w:ind w:left="280" w:hanging="200"/>
-              <w:rPr>
-                <w:rFonts w:ascii="Calibri" w:eastAsia="Calibri" w:hAnsi="Calibri" w:cs="Calibri"/>
-                <w:color w:val="2C2C2C"/>
-              </w:rPr>
-            </w:pPr>
-            <w:r>
-              <w:rPr>
-                <w:rFonts w:ascii="Calibri" w:eastAsia="Calibri" w:hAnsi="Calibri" w:cs="Calibri"/>
-                <w:color w:val="2C2C2C"/>
-              </w:rPr>
-              <w:t>• Built interactive management dashboards and analytics using TIBCO Spotfire, enabling faster operational insights and decision-making.</w:t>
-            </w:r>
-          </w:p>
-          <w:p>
-            <w:pPr>
+            </w:pPr>
+          </w:p>
+          <w:p>
+            <w:pPr>
+              <w:keepNext/>
               <w:tabs>
                 <w:tab w:val="right" w:pos="8040"/>
               </w:tabs>
@@ -1295,6 +1508,7 @@
           </w:p>
           <w:p>
             <w:pPr>
+              <w:keepNext/>
               <w:spacing w:after="100"/>
             </w:pPr>
             <w:r>
@@ -1335,6 +1549,7 @@
           </w:p>
           <w:p>
             <w:pPr>
+              <w:keepLines/>
               <w:spacing w:after="70"/>
               <w:ind w:left="280" w:hanging="200"/>
             </w:pPr>
@@ -1343,34 +1558,58 @@
                 <w:rFonts w:ascii="Calibri" w:eastAsia="Calibri" w:hAnsi="Calibri" w:cs="Calibri"/>
                 <w:color w:val="2C2C2C"/>
               </w:rPr>
-              <w:t>• As IT Manager: led project planning, resourcing, documentation, and client engagement; cleared risks so deliverables shipped on time.</w:t>
-            </w:r>
-          </w:p>
-          <w:p>
-            <w:pPr>
+              <w:t xml:space="preserve">• As IT Manager: led end-to-end project planning, infrastructure deployments, documentation, and stakeholder management for resort systems.</w:t>
+            </w:r>
+          </w:p>
+          <w:p>
+            <w:pPr>
+              <w:keepLines/>
               <w:spacing w:after="70"/>
               <w:ind w:left="280" w:hanging="200"/>
-              <w:rPr>
-                <w:rFonts w:ascii="Calibri" w:eastAsia="Calibri" w:hAnsi="Calibri" w:cs="Calibri"/>
-                <w:color w:val="2C2C2C"/>
-              </w:rPr>
-            </w:pPr>
-            <w:r>
-              <w:rPr>
-                <w:rFonts w:ascii="Calibri" w:eastAsia="Calibri" w:hAnsi="Calibri" w:cs="Calibri"/>
-                <w:color w:val="2C2C2C"/>
-              </w:rPr>
-              <w:t>• As IT Executive: delivered in-house Point of Sales (POS), Casino Management (CMS), and Automated Timekeeping System with Biometric (ATS); fully automated previously manual processes where applicable.</w:t>
-            </w:r>
-          </w:p>
-          <w:p>
-            <w:pPr>
+            </w:pPr>
+            <w:r>
+              <w:rPr>
+                <w:rFonts w:ascii="Calibri" w:eastAsia="Calibri" w:hAnsi="Calibri" w:cs="Calibri"/>
+                <w:color w:val="2C2C2C"/>
+              </w:rPr>
+              <w:t xml:space="preserve">• As IT Executive: designed and delivered the Resort Operations System Suite — Point of Sale (POS), Casino Management System (CMS), and Biometric Timekeeping (ATS) using VB.NET and SQL Server.</w:t>
+            </w:r>
+          </w:p>
+          <w:p>
+            <w:pPr>
+              <w:keepLines/>
+              <w:pBdr>
+                <w:left w:val="single" w:sz="12" w:space="6" w:color="1E7F76"/>
+              </w:pBdr>
+              <w:shd w:val="clear" w:color="auto" w:fill="EFF6F5"/>
+              <w:spacing w:before="100" w:after="140" w:line="259" w:lineRule="auto"/>
+              <w:ind w:left="140" w:right="100"/>
+            </w:pPr>
+            <w:r>
+              <w:rPr>
+                <w:rFonts w:ascii="Calibri" w:hAnsi="Calibri"/>
+                <w:b/>
+                <w:color w:val="1E7F76"/>
+                <w:sz w:val="18"/>
+              </w:rPr>
+              <w:t xml:space="preserve">Technologies: </w:t>
+            </w:r>
+            <w:r>
+              <w:rPr>
+                <w:rFonts w:ascii="Calibri" w:hAnsi="Calibri"/>
+                <w:color w:val="344454"/>
+                <w:sz w:val="18"/>
+              </w:rPr>
+              <w:t>VB.NET, PHP, SQL Server, POS, Casino Management System, biometric timekeeping.</w:t>
+            </w:r>
+          </w:p>
+          <w:p>
+            <w:pPr>
+              <w:keepNext/>
               <w:tabs>
                 <w:tab w:val="right" w:pos="8040"/>
               </w:tabs>
               <w:spacing w:before="180" w:after="30"/>
-            </w:pPr>
-            <w:r>
               <w:rPr>
                 <w:rFonts w:ascii="Calibri" w:eastAsia="Calibri" w:hAnsi="Calibri" w:cs="Calibri"/>
                 <w:b/>
@@ -1379,6 +1618,25 @@
                 <w:sz w:val="24"/>
                 <w:szCs w:val="24"/>
               </w:rPr>
+            </w:pPr>
+          </w:p>
+          <w:p>
+            <w:pPr>
+              <w:keepNext/>
+              <w:tabs>
+                <w:tab w:val="right" w:pos="8040"/>
+              </w:tabs>
+              <w:spacing w:before="180" w:after="30"/>
+            </w:pPr>
+            <w:r>
+              <w:rPr>
+                <w:rFonts w:ascii="Calibri" w:eastAsia="Calibri" w:hAnsi="Calibri" w:cs="Calibri"/>
+                <w:b/>
+                <w:bCs/>
+                <w:color w:val="2C2C2C"/>
+                <w:sz w:val="24"/>
+                <w:szCs w:val="24"/>
+              </w:rPr>
               <w:t>Senior Programmer / Junior Programmer</w:t>
             </w:r>
             <w:r>
@@ -1392,6 +1650,7 @@
           </w:p>
           <w:p>
             <w:pPr>
+              <w:keepNext/>
               <w:spacing w:after="100"/>
             </w:pPr>
             <w:r>
@@ -1408,6 +1667,7 @@
           </w:p>
           <w:p>
             <w:pPr>
+              <w:keepLines/>
               <w:spacing w:after="70"/>
               <w:ind w:left="280" w:hanging="200"/>
             </w:pPr>
@@ -1416,7 +1676,7 @@
                 <w:rFonts w:ascii="Calibri" w:eastAsia="Calibri" w:hAnsi="Calibri" w:cs="Calibri"/>
                 <w:color w:val="2C2C2C"/>
               </w:rPr>
-              <w:t xml:space="preserve">• As Senior Programmer: designed and built club systems covering employment, payroll, timekeeping, billing/collections, accounts payable, and POS for revenue </w:t>
+              <w:t xml:space="preserve">• Developed custom VB.NET and SQL Server applications for payroll, employee timekeeping, billing, collections, accounts payable, and POS.</w:t>
             </w:r>
             <w:proofErr w:type="spellStart"/>
             <w:r>
@@ -1424,7 +1684,7 @@
                 <w:rFonts w:ascii="Calibri" w:eastAsia="Calibri" w:hAnsi="Calibri" w:cs="Calibri"/>
                 <w:color w:val="2C2C2C"/>
               </w:rPr>
-              <w:t>centres</w:t>
+              <w:t/>
             </w:r>
             <w:proofErr w:type="spellEnd"/>
             <w:r>
@@ -1432,11 +1692,12 @@
                 <w:rFonts w:ascii="Calibri" w:eastAsia="Calibri" w:hAnsi="Calibri" w:cs="Calibri"/>
                 <w:color w:val="2C2C2C"/>
               </w:rPr>
-              <w:t xml:space="preserve"> and retail.</w:t>
-            </w:r>
-          </w:p>
-          <w:p>
-            <w:pPr>
+              <w:t xml:space="preserve"/>
+            </w:r>
+          </w:p>
+          <w:p>
+            <w:pPr>
+              <w:keepLines/>
               <w:spacing w:after="70"/>
               <w:ind w:left="280" w:hanging="200"/>
             </w:pPr>
@@ -1445,297 +1706,85 @@
                 <w:rFonts w:ascii="Calibri" w:eastAsia="Calibri" w:hAnsi="Calibri" w:cs="Calibri"/>
                 <w:color w:val="2C2C2C"/>
               </w:rPr>
-              <w:t>• Administered Windows Server, SCO UNIX, Novell NetWare, Oracle OPERA 4.04 PMS, and Micros-Fidelio; handled database tuning, indexing, and security.</w:t>
-            </w:r>
-          </w:p>
-          <w:p>
-            <w:pPr>
-              <w:spacing w:after="70"/>
-              <w:ind w:left="280" w:hanging="200"/>
-              <w:rPr>
-                <w:rFonts w:ascii="Calibri" w:eastAsia="Calibri" w:hAnsi="Calibri" w:cs="Calibri"/>
-                <w:color w:val="2C2C2C"/>
-              </w:rPr>
-            </w:pPr>
-            <w:r>
-              <w:rPr>
-                <w:rFonts w:ascii="Calibri" w:eastAsia="Calibri" w:hAnsi="Calibri" w:cs="Calibri"/>
-                <w:color w:val="2C2C2C"/>
-              </w:rPr>
-              <w:t>• As Junior Programmer: performed day-to-day monitoring of systems and databases (99% uptime target), built custom programs, evaluated vendors, and provided front-line IT support for members and staff.</w:t>
-            </w:r>
-          </w:p>
-          <w:p>
-            <w:pPr>
+              <w:t xml:space="preserve">• Administered multi-platform infrastructure including Windows Server, SCO UNIX, Novell NetWare, Oracle OPERA PMS, and Micros-Fidelio systems, maintaining 99% database uptime.</w:t>
+            </w:r>
+            <w:proofErr w:type="spellStart"/>
+            <w:r>
+              <w:rPr>
+                <w:rFonts w:ascii="Calibri" w:eastAsia="Calibri" w:hAnsi="Calibri" w:cs="Calibri"/>
+                <w:color w:val="2C2C2C"/>
+              </w:rPr>
+              <w:t/>
+            </w:r>
+            <w:proofErr w:type="spellEnd"/>
+            <w:r>
+              <w:rPr>
+                <w:rFonts w:ascii="Calibri" w:eastAsia="Calibri" w:hAnsi="Calibri" w:cs="Calibri"/>
+                <w:color w:val="2C2C2C"/>
+              </w:rPr>
+              <w:t xml:space="preserve"/>
+            </w:r>
+          </w:p>
+          <w:p>
+            <w:pPr>
+              <w:keepLines/>
+              <w:pBdr>
+                <w:left w:val="single" w:sz="12" w:space="6" w:color="1E7F76"/>
+              </w:pBdr>
+              <w:shd w:val="clear" w:color="auto" w:fill="EFF6F5"/>
+              <w:spacing w:before="100" w:after="140" w:line="259" w:lineRule="auto"/>
+              <w:ind w:left="140" w:right="100"/>
+            </w:pPr>
+            <w:r>
+              <w:rPr>
+                <w:rFonts w:ascii="Calibri" w:hAnsi="Calibri"/>
+                <w:b/>
+                <w:color w:val="1E7F76"/>
+                <w:sz w:val="18"/>
+              </w:rPr>
+              <w:t xml:space="preserve">Technologies: </w:t>
+            </w:r>
+            <w:r>
+              <w:rPr>
+                <w:rFonts w:ascii="Calibri" w:hAnsi="Calibri"/>
+                <w:color w:val="344454"/>
+                <w:sz w:val="18"/>
+              </w:rPr>
+              <w:t>VB.NET, SQL Server, Windows Server, SCO UNIX, Novell NetWare, Oracle OPERA PMS, Micros-Fidelio.</w:t>
+            </w:r>
+          </w:p>
+          <w:p>
+            <w:pPr>
+              <w:keepNext/>
               <w:pBdr>
                 <w:bottom w:val="single" w:sz="10" w:space="4" w:color="1E7F76"/>
               </w:pBdr>
               <w:spacing w:before="280" w:after="150"/>
-            </w:pPr>
-            <w:r>
               <w:rPr>
                 <w:rFonts w:ascii="Calibri" w:eastAsia="Calibri" w:hAnsi="Calibri" w:cs="Calibri"/>
                 <w:b/>
                 <w:bCs/>
                 <w:color w:val="24344A"/>
-                <w:sz w:val="24"/>
-                <w:szCs w:val="24"/>
-              </w:rPr>
-              <w:t>PROFESSIONAL CERTIFICATIONS</w:t>
-            </w:r>
-          </w:p>
-          <w:p>
-            <w:pPr>
-              <w:spacing w:after="90"/>
-              <w:ind w:left="220" w:hanging="220"/>
-            </w:pPr>
-            <w:r>
-              <w:rPr>
-                <w:rFonts w:ascii="Calibri" w:eastAsia="Calibri" w:hAnsi="Calibri" w:cs="Calibri"/>
-                <w:color w:val="1E7F76"/>
-              </w:rPr>
-              <w:t xml:space="preserve">• </w:t>
-            </w:r>
-            <w:proofErr w:type="spellStart"/>
-            <w:r>
-              <w:rPr>
-                <w:rFonts w:ascii="Calibri" w:eastAsia="Calibri" w:hAnsi="Calibri" w:cs="Calibri"/>
-                <w:color w:val="2C2C2C"/>
-              </w:rPr>
-              <w:t>OpenAI</w:t>
-            </w:r>
-            <w:proofErr w:type="spellEnd"/>
-            <w:r>
-              <w:rPr>
-                <w:rFonts w:ascii="Calibri" w:eastAsia="Calibri" w:hAnsi="Calibri" w:cs="Calibri"/>
-                <w:color w:val="2C2C2C"/>
-              </w:rPr>
-              <w:t xml:space="preserve"> Academy: Agent and Workflows (2026)</w:t>
-            </w:r>
-          </w:p>
-          <w:p>
-            <w:pPr>
-              <w:spacing w:after="90"/>
-              <w:ind w:left="220" w:hanging="220"/>
-            </w:pPr>
-            <w:r>
-              <w:rPr>
-                <w:rFonts w:ascii="Calibri" w:eastAsia="Calibri" w:hAnsi="Calibri" w:cs="Calibri"/>
-                <w:color w:val="1E7F76"/>
-              </w:rPr>
-              <w:t xml:space="preserve">• </w:t>
-            </w:r>
-            <w:r>
-              <w:rPr>
-                <w:rFonts w:ascii="Calibri" w:eastAsia="Calibri" w:hAnsi="Calibri" w:cs="Calibri"/>
-                <w:color w:val="2C2C2C"/>
-              </w:rPr>
-              <w:t>No Code Automation with Zapier (2026)</w:t>
-            </w:r>
-            <w:r>
-              <w:rPr>
-                <w:rFonts w:ascii="Calibri" w:eastAsia="Calibri" w:hAnsi="Calibri" w:cs="Calibri"/>
-                <w:color w:val="2C2C2C"/>
-              </w:rPr>
-              <w:t xml:space="preserve"> </w:t>
-            </w:r>
-            <w:r>
-              <w:rPr>
-                <w:rFonts w:ascii="Calibri" w:eastAsia="Calibri" w:hAnsi="Calibri" w:cs="Calibri"/>
-                <w:color w:val="1E7F76"/>
-              </w:rPr>
-              <w:t xml:space="preserve">• </w:t>
-            </w:r>
-            <w:r>
-              <w:rPr>
-                <w:rFonts w:ascii="Calibri" w:eastAsia="Calibri" w:hAnsi="Calibri" w:cs="Calibri"/>
-                <w:color w:val="2C2C2C"/>
-              </w:rPr>
-              <w:t xml:space="preserve">QS101: N8N </w:t>
-            </w:r>
-            <w:proofErr w:type="spellStart"/>
-            <w:r>
-              <w:rPr>
-                <w:rFonts w:ascii="Calibri" w:eastAsia="Calibri" w:hAnsi="Calibri" w:cs="Calibri"/>
-                <w:color w:val="2C2C2C"/>
-              </w:rPr>
-              <w:t>Quickstart</w:t>
-            </w:r>
-            <w:proofErr w:type="spellEnd"/>
-            <w:r>
-              <w:rPr>
-                <w:rFonts w:ascii="Calibri" w:eastAsia="Calibri" w:hAnsi="Calibri" w:cs="Calibri"/>
-                <w:color w:val="2C2C2C"/>
-              </w:rPr>
-              <w:t xml:space="preserve"> (2026)</w:t>
-            </w:r>
-          </w:p>
-          <w:p>
-            <w:pPr>
-              <w:spacing w:after="90"/>
-              <w:ind w:left="220" w:hanging="220"/>
-            </w:pPr>
-            <w:r>
-              <w:rPr>
-                <w:rFonts w:ascii="Calibri" w:eastAsia="Calibri" w:hAnsi="Calibri" w:cs="Calibri"/>
-                <w:color w:val="1E7F76"/>
-              </w:rPr>
-              <w:t xml:space="preserve">• </w:t>
-            </w:r>
-            <w:r>
-              <w:rPr>
-                <w:rFonts w:ascii="Calibri" w:eastAsia="Calibri" w:hAnsi="Calibri" w:cs="Calibri"/>
-                <w:color w:val="2C2C2C"/>
-              </w:rPr>
-              <w:t xml:space="preserve">The Complete </w:t>
-            </w:r>
-            <w:proofErr w:type="spellStart"/>
-            <w:r>
-              <w:rPr>
-                <w:rFonts w:ascii="Calibri" w:eastAsia="Calibri" w:hAnsi="Calibri" w:cs="Calibri"/>
-                <w:color w:val="2C2C2C"/>
-              </w:rPr>
-              <w:t>ReactJs</w:t>
-            </w:r>
-            <w:proofErr w:type="spellEnd"/>
-            <w:r>
-              <w:rPr>
-                <w:rFonts w:ascii="Calibri" w:eastAsia="Calibri" w:hAnsi="Calibri" w:cs="Calibri"/>
-                <w:color w:val="2C2C2C"/>
-              </w:rPr>
-              <w:t xml:space="preserve"> Course - Basics to Advanced (2026)</w:t>
-            </w:r>
-          </w:p>
-          <w:p>
-            <w:pPr>
-              <w:spacing w:after="90"/>
-              <w:ind w:left="220" w:hanging="220"/>
-            </w:pPr>
-            <w:r>
-              <w:rPr>
-                <w:rFonts w:ascii="Calibri" w:eastAsia="Calibri" w:hAnsi="Calibri" w:cs="Calibri"/>
-                <w:color w:val="1E7F76"/>
-              </w:rPr>
-              <w:t xml:space="preserve">• </w:t>
-            </w:r>
-            <w:r>
-              <w:rPr>
-                <w:rFonts w:ascii="Calibri" w:eastAsia="Calibri" w:hAnsi="Calibri" w:cs="Calibri"/>
-                <w:color w:val="2C2C2C"/>
-              </w:rPr>
-              <w:t>Google AI Studio Bootcamp: Build Pro Apps with Gemini (2026)</w:t>
-            </w:r>
-          </w:p>
-          <w:p>
-            <w:pPr>
-              <w:spacing w:after="90"/>
-              <w:ind w:left="220" w:hanging="220"/>
-            </w:pPr>
-            <w:r>
-              <w:rPr>
-                <w:rFonts w:ascii="Calibri" w:eastAsia="Calibri" w:hAnsi="Calibri" w:cs="Calibri"/>
-                <w:color w:val="1E7F76"/>
-              </w:rPr>
-              <w:t xml:space="preserve">• </w:t>
-            </w:r>
-            <w:r>
-              <w:rPr>
-                <w:rFonts w:ascii="Calibri" w:eastAsia="Calibri" w:hAnsi="Calibri" w:cs="Calibri"/>
-                <w:color w:val="2C2C2C"/>
-              </w:rPr>
-              <w:t>Claude Pro: Build, Integrate &amp; Optimize AI Solutions (2026)</w:t>
-            </w:r>
-          </w:p>
-          <w:p>
-            <w:pPr>
-              <w:spacing w:after="90"/>
-              <w:ind w:left="220" w:hanging="220"/>
-            </w:pPr>
-            <w:r>
-              <w:rPr>
-                <w:rFonts w:ascii="Calibri" w:eastAsia="Calibri" w:hAnsi="Calibri" w:cs="Calibri"/>
-                <w:color w:val="1E7F76"/>
-              </w:rPr>
-              <w:t xml:space="preserve">• </w:t>
-            </w:r>
-            <w:r>
-              <w:rPr>
-                <w:rFonts w:ascii="Calibri" w:eastAsia="Calibri" w:hAnsi="Calibri" w:cs="Calibri"/>
-                <w:color w:val="2C2C2C"/>
-              </w:rPr>
-              <w:t>Learn Infra as a Code with Azure Bicep (2025)</w:t>
-            </w:r>
-          </w:p>
-          <w:p>
-            <w:pPr>
-              <w:spacing w:after="90"/>
-              <w:ind w:left="220" w:hanging="220"/>
-            </w:pPr>
-            <w:r>
-              <w:rPr>
-                <w:rFonts w:ascii="Calibri" w:eastAsia="Calibri" w:hAnsi="Calibri" w:cs="Calibri"/>
-                <w:color w:val="1E7F76"/>
-              </w:rPr>
-              <w:t xml:space="preserve">• </w:t>
-            </w:r>
-            <w:r>
-              <w:rPr>
-                <w:rFonts w:ascii="Calibri" w:eastAsia="Calibri" w:hAnsi="Calibri" w:cs="Calibri"/>
-                <w:color w:val="2C2C2C"/>
-              </w:rPr>
-              <w:t>Learn Azure DevOps CI/CD pipelines (2025)</w:t>
-            </w:r>
-          </w:p>
-          <w:p>
-            <w:pPr>
-              <w:spacing w:after="90"/>
-              <w:ind w:left="220" w:hanging="220"/>
-            </w:pPr>
-            <w:r>
-              <w:rPr>
-                <w:rFonts w:ascii="Calibri" w:eastAsia="Calibri" w:hAnsi="Calibri" w:cs="Calibri"/>
-                <w:color w:val="1E7F76"/>
-              </w:rPr>
-              <w:t xml:space="preserve">• </w:t>
-            </w:r>
-            <w:r>
-              <w:rPr>
-                <w:rFonts w:ascii="Calibri" w:eastAsia="Calibri" w:hAnsi="Calibri" w:cs="Calibri"/>
-                <w:color w:val="2C2C2C"/>
-              </w:rPr>
-              <w:t>Code Reviews for Secure, Clean, and Scalable Code (2024)</w:t>
-            </w:r>
-          </w:p>
-          <w:p>
-            <w:pPr>
-              <w:spacing w:after="90"/>
-              <w:ind w:left="220" w:hanging="220"/>
-              <w:rPr>
-                <w:rFonts w:ascii="Calibri" w:eastAsia="Calibri" w:hAnsi="Calibri" w:cs="Calibri"/>
-                <w:color w:val="2C2C2C"/>
-              </w:rPr>
-            </w:pPr>
-            <w:r>
-              <w:rPr>
-                <w:rFonts w:ascii="Calibri" w:eastAsia="Calibri" w:hAnsi="Calibri" w:cs="Calibri"/>
-                <w:color w:val="1E7F76"/>
-              </w:rPr>
-              <w:t xml:space="preserve">• </w:t>
-            </w:r>
-            <w:r>
-              <w:rPr>
-                <w:rFonts w:ascii="Calibri" w:eastAsia="Calibri" w:hAnsi="Calibri" w:cs="Calibri"/>
-                <w:color w:val="2C2C2C"/>
-              </w:rPr>
-              <w:t>Data Engineering Pathway (2023)</w:t>
-            </w:r>
-          </w:p>
-          <w:p>
-            <w:pPr>
+                <w:sz w:val="2"/>
+                <w:szCs w:val="2"/>
+              </w:rPr>
+            </w:pPr>
+          </w:p>
+          <w:p>
+            <w:pPr>
+              <w:keepNext/>
               <w:pBdr>
                 <w:bottom w:val="single" w:sz="10" w:space="4" w:color="1E7F76"/>
               </w:pBdr>
               <w:spacing w:before="280" w:after="150"/>
+              <w:rPr>
+                <w:rFonts w:ascii="Calibri" w:eastAsia="Calibri" w:hAnsi="Calibri" w:cs="Calibri"/>
+                <w:b/>
+                <w:bCs/>
+                <w:color w:val="24344A"/>
+                <w:sz w:val="24"/>
+                <w:szCs w:val="24"/>
+              </w:rPr>
             </w:pPr>
             <w:r>
               <w:rPr>

</xml_diff>

<commit_message>
chore: remove freelance automation role from CV docx and pdf
Co-Authored-By: Claude Opus 5.5 <noreply@anthropic.com>
</commit_message>
<xml_diff>
--- a/public/documents/CV_Patrick_Gonzaga.docx
+++ b/public/documents/CV_Patrick_Gonzaga.docx
@@ -219,17 +219,8 @@
                 <w:rFonts w:ascii="Calibri" w:eastAsia="Calibri" w:hAnsi="Calibri" w:cs="Calibri"/>
                 <w:color w:val="E2E8EE"/>
               </w:rPr>
-              <w:t>C# · ASP.NET Core · EF Core · VB.NET · REST/</w:t>
-            </w:r>
-            <w:proofErr w:type="spellStart"/>
-            <w:r>
-              <w:rPr>
-                <w:rFonts w:ascii="Calibri" w:eastAsia="Calibri" w:hAnsi="Calibri" w:cs="Calibri"/>
-                <w:color w:val="E2E8EE"/>
-              </w:rPr>
-              <w:t>OpenAPI</w:t>
-            </w:r>
-            <w:proofErr w:type="spellEnd"/>
+              <w:t>C# · ASP.NET Core · EF Core · VB.NET · REST/OpenAPI</w:t>
+            </w:r>
           </w:p>
           <w:p>
             <w:pPr>
@@ -256,23 +247,7 @@
                 <w:rFonts w:ascii="Calibri" w:eastAsia="Calibri" w:hAnsi="Calibri" w:cs="Calibri"/>
                 <w:color w:val="E2E8EE"/>
               </w:rPr>
-              <w:t xml:space="preserve">Azure (App Config, Key Vault, App Insights, Service Bus, Blob Storage, Redis, Functions) · AWS (S3, SQS) · Azure DevOps · </w:t>
-            </w:r>
-            <w:proofErr w:type="spellStart"/>
-            <w:r>
-              <w:rPr>
-                <w:rFonts w:ascii="Calibri" w:eastAsia="Calibri" w:hAnsi="Calibri" w:cs="Calibri"/>
-                <w:color w:val="E2E8EE"/>
-              </w:rPr>
-              <w:t>Buildkite</w:t>
-            </w:r>
-            <w:proofErr w:type="spellEnd"/>
-            <w:r>
-              <w:rPr>
-                <w:rFonts w:ascii="Calibri" w:eastAsia="Calibri" w:hAnsi="Calibri" w:cs="Calibri"/>
-                <w:color w:val="E2E8EE"/>
-              </w:rPr>
-              <w:t xml:space="preserve"> · Git</w:t>
+              <w:t>Azure (App Config, Key Vault, App Insights, Service Bus, Blob Storage, Redis, Functions) · AWS (S3, SQS) · Azure DevOps · Buildkite · Git</w:t>
             </w:r>
           </w:p>
           <w:p>
@@ -556,7 +531,7 @@
                       <w:rFonts w:ascii="Calibri" w:eastAsia="Calibri" w:hAnsi="Calibri" w:cs="Calibri"/>
                       <w:color w:val="2C2C2C"/>
                     </w:rPr>
-                    <w:t xml:space="preserve">Software engineer with 2 decades of experience across software development, enterprise applications, databases, integrations and IT systems, with 5+ years of C# / modern .NET and 15+ years of VB.NET enterprise experience.</w:t>
+                    <w:t>Software engineer with 2 decades of experience across software development, enterprise applications, databases, integrations and IT systems, with 5+ years of C# / modern .NET and 15+ years of VB.NET enterprise experience.</w:t>
                   </w:r>
                 </w:p>
               </w:tc>
@@ -598,7 +573,7 @@
                 <w:sz w:val="24"/>
                 <w:szCs w:val="24"/>
               </w:rPr>
-              <w:t>Automation &amp; Integration Developer (Freelance, Part-time)</w:t>
+              <w:t>Backend Developer</w:t>
             </w:r>
             <w:r>
               <w:rPr>
@@ -606,13 +581,16 @@
                 <w:color w:val="6B7280"/>
               </w:rPr>
               <w:tab/>
-              <w:t>Sep 2026 – Present</w:t>
-            </w:r>
-          </w:p>
-          <w:p>
-            <w:pPr>
-              <w:keepNext/>
-              <w:spacing w:after="100"/>
+              <w:t>2023 - 2026</w:t>
+            </w:r>
+            <w:r>
+              <w:rPr>
+                <w:rFonts w:ascii="Calibri" w:eastAsia="Calibri" w:hAnsi="Calibri" w:cs="Calibri"/>
+                <w:color w:val="6B7280"/>
+              </w:rPr>
+              <w:br/>
+            </w:r>
+            <w:r>
               <w:rPr>
                 <w:rFonts w:ascii="Calibri" w:eastAsia="Calibri" w:hAnsi="Calibri" w:cs="Calibri"/>
                 <w:b/>
@@ -621,17 +599,27 @@
                 <w:sz w:val="22"/>
                 <w:szCs w:val="22"/>
               </w:rPr>
-            </w:pPr>
-            <w:r>
-              <w:rPr>
-                <w:rFonts w:ascii="Calibri" w:eastAsia="Calibri" w:hAnsi="Calibri" w:cs="Calibri"/>
-                <w:b/>
-                <w:bCs/>
+              <w:t>Client: Discovery Holiday Parks AU @ Emapta</w:t>
+            </w:r>
+            <w:r>
+              <w:rPr>
+                <w:rFonts w:ascii="Calibri" w:eastAsia="Calibri" w:hAnsi="Calibri" w:cs="Calibri"/>
+                <w:b/>
+                <w:bCs/>
+                <w:i/>
+                <w:iCs/>
                 <w:color w:val="1E7F76"/>
                 <w:sz w:val="22"/>
                 <w:szCs w:val="22"/>
               </w:rPr>
-              <w:t xml:space="preserve">Australian IT services firm | Remote</w:t>
+              <w:t xml:space="preserve"> </w:t>
+            </w:r>
+            <w:r>
+              <w:rPr>
+                <w:rFonts w:ascii="Calibri" w:eastAsia="Calibri" w:hAnsi="Calibri" w:cs="Calibri"/>
+                <w:color w:val="6B7280"/>
+              </w:rPr>
+              <w:tab/>
             </w:r>
           </w:p>
           <w:p>
@@ -640,24 +628,15 @@
               <w:spacing w:after="100"/>
               <w:rPr>
                 <w:rFonts w:ascii="Calibri" w:eastAsia="Calibri" w:hAnsi="Calibri" w:cs="Calibri"/>
-                <w:b/>
-                <w:bCs/>
+                <w:color w:val="6B7280"/>
+              </w:rPr>
+            </w:pPr>
+            <w:r>
+              <w:rPr>
+                <w:rFonts w:ascii="Calibri" w:eastAsia="Calibri" w:hAnsi="Calibri" w:cs="Calibri"/>
                 <w:color w:val="1E7F76"/>
-                <w:sz w:val="22"/>
-                <w:szCs w:val="22"/>
-              </w:rPr>
-            </w:pPr>
-            <w:r>
-              <w:rPr>
-                <w:rFonts w:ascii="Calibri" w:eastAsia="Calibri" w:hAnsi="Calibri" w:cs="Calibri"/>
-                <w:b w:val="0"/>
-                <w:bCs/>
-                <w:color w:val="6B7280"/>
-                <w:sz w:val="18"/>
-                <w:szCs w:val="22"/>
-                <w:i w:val="1"/>
-              </w:rPr>
-              <w:t xml:space="preserve">Client engagements under NDA</w:t>
+              </w:rPr>
+              <w:t>https://discoveryholidayparks.com.au · https://wikicamps.com.au</w:t>
             </w:r>
           </w:p>
           <w:p>
@@ -671,23 +650,7 @@
                 <w:rFonts w:ascii="Calibri" w:eastAsia="Calibri" w:hAnsi="Calibri" w:cs="Calibri"/>
                 <w:color w:val="2C2C2C"/>
               </w:rPr>
-              <w:t xml:space="preserve">• Build AI knowledge platforms, document ingestion and synchronization pipelines, MCP integrations and automation workflows; operate and troubleshoot OpenClaw-based agents.</w:t>
-            </w:r>
-            <w:proofErr w:type="spellStart"/>
-            <w:r>
-              <w:rPr>
-                <w:rFonts w:ascii="Calibri" w:eastAsia="Calibri" w:hAnsi="Calibri" w:cs="Calibri"/>
-                <w:color w:val="2C2C2C"/>
-              </w:rPr>
-              <w:t/>
-            </w:r>
-            <w:proofErr w:type="spellEnd"/>
-            <w:r>
-              <w:rPr>
-                <w:rFonts w:ascii="Calibri" w:eastAsia="Calibri" w:hAnsi="Calibri" w:cs="Calibri"/>
-                <w:color w:val="2C2C2C"/>
-              </w:rPr>
-              <w:t/>
+              <w:t>• Built and maintained C# / .NET / ASP.NET Core APIs and EF Core data access for Deals and WikiCamps, contributing shared services across sites, forums, accounts, trips and media.</w:t>
             </w:r>
           </w:p>
           <w:p>
@@ -701,23 +664,7 @@
                 <w:rFonts w:ascii="Calibri" w:eastAsia="Calibri" w:hAnsi="Calibri" w:cs="Calibri"/>
                 <w:color w:val="2C2C2C"/>
               </w:rPr>
-              <w:t xml:space="preserve">• Deliver secure cloud deployments, infrastructure as code and CI/CD, with access controls, secrets management, backups, automated tests and release rollback.</w:t>
-            </w:r>
-            <w:proofErr w:type="spellStart"/>
-            <w:r>
-              <w:rPr>
-                <w:rFonts w:ascii="Calibri" w:eastAsia="Calibri" w:hAnsi="Calibri" w:cs="Calibri"/>
-                <w:color w:val="2C2C2C"/>
-              </w:rPr>
-              <w:t/>
-            </w:r>
-            <w:proofErr w:type="spellEnd"/>
-            <w:r>
-              <w:rPr>
-                <w:rFonts w:ascii="Calibri" w:eastAsia="Calibri" w:hAnsi="Calibri" w:cs="Calibri"/>
-                <w:color w:val="2C2C2C"/>
-              </w:rPr>
-              <w:t/>
+              <w:t>• Delivered event-driven workflows with Azure Service Bus, Functions, Redis, Blob Storage, Key Vault and Application Insights; integrated BookEasy, OSRM with Polly, and Azure AI Search.</w:t>
             </w:r>
           </w:p>
           <w:p>
@@ -731,23 +678,7 @@
                 <w:rFonts w:ascii="Calibri" w:eastAsia="Calibri" w:hAnsi="Calibri" w:cs="Calibri"/>
                 <w:color w:val="2C2C2C"/>
               </w:rPr>
-              <w:t xml:space="preserve">• Investigate and resolve web application and integration issues, implement features and regression tests, review changes and verify production releases.</w:t>
-            </w:r>
-            <w:proofErr w:type="spellStart"/>
-            <w:r>
-              <w:rPr>
-                <w:rFonts w:ascii="Calibri" w:eastAsia="Calibri" w:hAnsi="Calibri" w:cs="Calibri"/>
-                <w:color w:val="2C2C2C"/>
-              </w:rPr>
-              <w:t/>
-            </w:r>
-            <w:proofErr w:type="spellEnd"/>
-            <w:r>
-              <w:rPr>
-                <w:rFonts w:ascii="Calibri" w:eastAsia="Calibri" w:hAnsi="Calibri" w:cs="Calibri"/>
-                <w:color w:val="2C2C2C"/>
-              </w:rPr>
-              <w:t/>
+              <w:t>• Owned the Retool Admin Portal, including pages, resources, SQL queries and multi-environment configuration for deals, bookings and WikiCamps.</w:t>
             </w:r>
           </w:p>
           <w:p>
@@ -761,23 +692,7 @@
                 <w:rFonts w:ascii="Calibri" w:eastAsia="Calibri" w:hAnsi="Calibri" w:cs="Calibri"/>
                 <w:color w:val="2C2C2C"/>
               </w:rPr>
-              <w:t xml:space="preserve">• Translate business processes into scopes, estimates and delivery plans; produce SOPs, technical guides and runbooks, and support stakeholder sessions and remote setup.</w:t>
-            </w:r>
-            <w:proofErr w:type="spellStart"/>
-            <w:r>
-              <w:rPr>
-                <w:rFonts w:ascii="Calibri" w:eastAsia="Calibri" w:hAnsi="Calibri" w:cs="Calibri"/>
-                <w:color w:val="2C2C2C"/>
-              </w:rPr>
-              <w:t/>
-            </w:r>
-            <w:proofErr w:type="spellEnd"/>
-            <w:r>
-              <w:rPr>
-                <w:rFonts w:ascii="Calibri" w:eastAsia="Calibri" w:hAnsi="Calibri" w:cs="Calibri"/>
-                <w:color w:val="2C2C2C"/>
-              </w:rPr>
-              <w:t/>
+              <w:t>• Enforced SonarQube code quality, security and coverage standards; used Cursor and MCP for read-only Azure / SQL context, reviewing and validating changes before release.</w:t>
             </w:r>
           </w:p>
           <w:p>
@@ -805,101 +720,17 @@
                 <w:color w:val="344454"/>
                 <w:sz w:val="18"/>
               </w:rPr>
-              <w:t>Node.js, MCP, Claude / Claude Code, OpenClaw, n8n, Docker, Linux, Azure (Key Vault, Bicep, NSG, Backup, CLI), Google OAuth / Drive API, rclone, Markdown / Obsidian, Caddy, systemd, GitHub Actions, Git.</w:t>
-            </w:r>
-            <w:proofErr w:type="spellStart"/>
-            <w:r>
-              <w:rPr>
-                <w:rFonts w:ascii="Calibri" w:hAnsi="Calibri"/>
-                <w:color w:val="344454"/>
-                <w:sz w:val="18"/>
-              </w:rPr>
-            </w:r>
-            <w:proofErr w:type="spellEnd"/>
-            <w:r>
-              <w:rPr>
-                <w:rFonts w:ascii="Calibri" w:hAnsi="Calibri"/>
-                <w:color w:val="344454"/>
-                <w:sz w:val="18"/>
-              </w:rPr>
+              <w:t>C#, .NET, ASP.NET Core, EF Core, REST APIs, Azure (Key Vault, Application Insights, Redis, Blob Storage, Service Bus, Functions, AI Search), SQL Server, Retool, Polly, SonarQube, Cursor, MCP.</w:t>
             </w:r>
           </w:p>
           <w:p>
             <w:pPr>
               <w:keepNext/>
+              <w:pageBreakBefore/>
               <w:tabs>
                 <w:tab w:val="right" w:pos="8040"/>
               </w:tabs>
-              <w:spacing w:before="180" w:after="50"/>
-              <w:rPr>
-                <w:rFonts w:ascii="Calibri" w:eastAsia="Calibri" w:hAnsi="Calibri" w:cs="Calibri"/>
-                <w:b/>
-                <w:bCs/>
-                <w:color w:val="24344A"/>
-                <w:sz w:val="24"/>
-                <w:szCs w:val="24"/>
-              </w:rPr>
-            </w:pPr>
-          </w:p>
-          <w:p>
-            <w:pPr>
-              <w:keepNext/>
-              <w:tabs>
-                <w:tab w:val="right" w:pos="8040"/>
-              </w:tabs>
-              <w:spacing w:before="180" w:after="50"/>
-            </w:pPr>
-            <w:r>
-              <w:rPr>
-                <w:rFonts w:ascii="Calibri" w:eastAsia="Calibri" w:hAnsi="Calibri" w:cs="Calibri"/>
-                <w:b/>
-                <w:bCs/>
-                <w:color w:val="24344A"/>
-                <w:sz w:val="24"/>
-                <w:szCs w:val="24"/>
-              </w:rPr>
-              <w:t>Backend Developer</w:t>
-            </w:r>
-            <w:r>
-              <w:rPr>
-                <w:rFonts w:ascii="Calibri" w:eastAsia="Calibri" w:hAnsi="Calibri" w:cs="Calibri"/>
-                <w:color w:val="6B7280"/>
-              </w:rPr>
-              <w:tab/>
-              <w:t>2023 - 2026</w:t>
-            </w:r>
-            <w:r>
-              <w:rPr>
-                <w:rFonts w:ascii="Calibri" w:eastAsia="Calibri" w:hAnsi="Calibri" w:cs="Calibri"/>
-                <w:color w:val="6B7280"/>
-              </w:rPr>
-              <w:br/>
-            </w:r>
-            <w:r>
-              <w:rPr>
-                <w:rFonts w:ascii="Calibri" w:eastAsia="Calibri" w:hAnsi="Calibri" w:cs="Calibri"/>
-                <w:b/>
-                <w:bCs/>
-                <w:color w:val="1E7F76"/>
-                <w:sz w:val="22"/>
-                <w:szCs w:val="22"/>
-              </w:rPr>
-              <w:t xml:space="preserve">Client: Discovery Holiday Parks AU @ </w:t>
-            </w:r>
-            <w:proofErr w:type="spellStart"/>
-            <w:r>
-              <w:rPr>
-                <w:rFonts w:ascii="Calibri" w:eastAsia="Calibri" w:hAnsi="Calibri" w:cs="Calibri"/>
-                <w:b/>
-                <w:bCs/>
-                <w:color w:val="1E7F76"/>
-                <w:sz w:val="22"/>
-                <w:szCs w:val="22"/>
-              </w:rPr>
-              <w:t>Emapta</w:t>
-            </w:r>
-            <w:proofErr w:type="spellEnd"/>
-            <w:r>
+              <w:spacing w:before="120" w:after="30"/>
               <w:rPr>
                 <w:rFonts w:ascii="Calibri" w:eastAsia="Calibri" w:hAnsi="Calibri" w:cs="Calibri"/>
                 <w:b/>
@@ -910,7 +741,40 @@
                 <w:sz w:val="22"/>
                 <w:szCs w:val="22"/>
               </w:rPr>
-              <w:t xml:space="preserve"> </w:t>
+            </w:pPr>
+          </w:p>
+          <w:p>
+            <w:pPr>
+              <w:keepNext/>
+              <w:pageBreakBefore/>
+              <w:tabs>
+                <w:tab w:val="right" w:pos="8040"/>
+              </w:tabs>
+              <w:spacing w:before="120" w:after="30"/>
+            </w:pPr>
+            <w:r>
+              <w:rPr>
+                <w:rFonts w:ascii="Calibri" w:eastAsia="Calibri" w:hAnsi="Calibri" w:cs="Calibri"/>
+                <w:b/>
+                <w:bCs/>
+                <w:i/>
+                <w:iCs/>
+                <w:color w:val="1E7F76"/>
+                <w:sz w:val="22"/>
+                <w:szCs w:val="22"/>
+              </w:rPr>
+              <w:t>.</w:t>
+            </w:r>
+            <w:r>
+              <w:rPr>
+                <w:rFonts w:ascii="Calibri" w:eastAsia="Calibri" w:hAnsi="Calibri" w:cs="Calibri"/>
+                <w:b/>
+                <w:bCs/>
+                <w:color w:val="24344A"/>
+                <w:sz w:val="24"/>
+                <w:szCs w:val="24"/>
+              </w:rPr>
+              <w:t>NET Developer</w:t>
             </w:r>
             <w:r>
               <w:rPr>
@@ -918,23 +782,40 @@
                 <w:color w:val="6B7280"/>
               </w:rPr>
               <w:tab/>
+              <w:t>2021 – 2023</w:t>
             </w:r>
           </w:p>
           <w:p>
             <w:pPr>
               <w:keepNext/>
               <w:spacing w:after="100"/>
-              <w:rPr>
-                <w:rFonts w:ascii="Calibri" w:eastAsia="Calibri" w:hAnsi="Calibri" w:cs="Calibri"/>
+            </w:pPr>
+            <w:r>
+              <w:rPr>
+                <w:rFonts w:ascii="Calibri" w:eastAsia="Calibri" w:hAnsi="Calibri" w:cs="Calibri"/>
+                <w:b/>
+                <w:bCs/>
+                <w:color w:val="1E7F76"/>
+                <w:sz w:val="22"/>
+                <w:szCs w:val="22"/>
+              </w:rPr>
+              <w:t>Client: Optimatech AU @ Emapta</w:t>
+            </w:r>
+            <w:r>
+              <w:rPr>
+                <w:rFonts w:ascii="Calibri" w:eastAsia="Calibri" w:hAnsi="Calibri" w:cs="Calibri"/>
+                <w:i/>
+                <w:iCs/>
                 <w:color w:val="6B7280"/>
               </w:rPr>
-            </w:pPr>
+              <w:br/>
+            </w:r>
             <w:r>
               <w:rPr>
                 <w:rFonts w:ascii="Calibri" w:eastAsia="Calibri" w:hAnsi="Calibri" w:cs="Calibri"/>
                 <w:color w:val="1E7F76"/>
               </w:rPr>
-              <w:t>https://discoveryholidayparks.com.au · https://wikicamps.com.au</w:t>
+              <w:t>https://optimatech.io</w:t>
             </w:r>
           </w:p>
           <w:p>
@@ -948,23 +829,7 @@
                 <w:rFonts w:ascii="Calibri" w:eastAsia="Calibri" w:hAnsi="Calibri" w:cs="Calibri"/>
                 <w:color w:val="2C2C2C"/>
               </w:rPr>
-              <w:t xml:space="preserve">• Built and maintained C# / .NET / ASP.NET Core APIs and EF Core data access for Deals and WikiCamps, contributing shared services across sites, forums, accounts, trips and media.</w:t>
-            </w:r>
-            <w:proofErr w:type="spellStart"/>
-            <w:r>
-              <w:rPr>
-                <w:rFonts w:ascii="Calibri" w:eastAsia="Calibri" w:hAnsi="Calibri" w:cs="Calibri"/>
-                <w:color w:val="2C2C2C"/>
-              </w:rPr>
-              <w:t/>
-            </w:r>
-            <w:proofErr w:type="spellEnd"/>
-            <w:r>
-              <w:rPr>
-                <w:rFonts w:ascii="Calibri" w:eastAsia="Calibri" w:hAnsi="Calibri" w:cs="Calibri"/>
-                <w:color w:val="2C2C2C"/>
-              </w:rPr>
-              <w:t/>
+              <w:t>• Built, maintained and refactored C# / .NET energy applications, using AWS S3 and SQS for scalable storage and reliable asynchronous messaging.</w:t>
             </w:r>
           </w:p>
           <w:p>
@@ -978,23 +843,7 @@
                 <w:rFonts w:ascii="Calibri" w:eastAsia="Calibri" w:hAnsi="Calibri" w:cs="Calibri"/>
                 <w:color w:val="2C2C2C"/>
               </w:rPr>
-              <w:t xml:space="preserve">• Delivered event-driven workflows with Azure Service Bus, Functions, Redis, Blob Storage, Key Vault and Application Insights; integrated BookEasy, OSRM with Polly, and Azure AI Search.</w:t>
-            </w:r>
-            <w:proofErr w:type="spellStart"/>
-            <w:r>
-              <w:rPr>
-                <w:rFonts w:ascii="Calibri" w:eastAsia="Calibri" w:hAnsi="Calibri" w:cs="Calibri"/>
-                <w:color w:val="2C2C2C"/>
-              </w:rPr>
-              <w:t/>
-            </w:r>
-            <w:proofErr w:type="spellEnd"/>
-            <w:r>
-              <w:rPr>
-                <w:rFonts w:ascii="Calibri" w:eastAsia="Calibri" w:hAnsi="Calibri" w:cs="Calibri"/>
-                <w:color w:val="2C2C2C"/>
-              </w:rPr>
-              <w:t/>
+              <w:t>• Applied Clean Architecture, code reviews and Snyk security scanning; automated validation maintained 99% meter data accuracy.</w:t>
             </w:r>
           </w:p>
           <w:p>
@@ -1008,23 +857,7 @@
                 <w:rFonts w:ascii="Calibri" w:eastAsia="Calibri" w:hAnsi="Calibri" w:cs="Calibri"/>
                 <w:color w:val="2C2C2C"/>
               </w:rPr>
-              <w:t xml:space="preserve">• Owned the Retool Admin Portal, including pages, resources, SQL queries and multi-environment configuration for deals, bookings and WikiCamps.</w:t>
-            </w:r>
-            <w:proofErr w:type="spellStart"/>
-            <w:r>
-              <w:rPr>
-                <w:rFonts w:ascii="Calibri" w:eastAsia="Calibri" w:hAnsi="Calibri" w:cs="Calibri"/>
-                <w:color w:val="2C2C2C"/>
-              </w:rPr>
-              <w:t/>
-            </w:r>
-            <w:proofErr w:type="spellEnd"/>
-            <w:r>
-              <w:rPr>
-                <w:rFonts w:ascii="Calibri" w:eastAsia="Calibri" w:hAnsi="Calibri" w:cs="Calibri"/>
-                <w:color w:val="2C2C2C"/>
-              </w:rPr>
-              <w:t/>
+              <w:t>• Delivered releases across Test, UAT and Production using Buildkite CI/CD with minimal downtime.</w:t>
             </w:r>
           </w:p>
           <w:p>
@@ -1038,23 +871,8 @@
                 <w:rFonts w:ascii="Calibri" w:eastAsia="Calibri" w:hAnsi="Calibri" w:cs="Calibri"/>
                 <w:color w:val="2C2C2C"/>
               </w:rPr>
-              <w:t xml:space="preserve">• Enforced SonarQube code quality, security and coverage standards; used Cursor and MCP for read-only Azure / SQL context, reviewing and validating changes before release.</w:t>
-            </w:r>
-            <w:proofErr w:type="spellStart"/>
-            <w:r>
-              <w:rPr>
-                <w:rFonts w:ascii="Calibri" w:eastAsia="Calibri" w:hAnsi="Calibri" w:cs="Calibri"/>
-                <w:color w:val="2C2C2C"/>
-              </w:rPr>
-              <w:t/>
-            </w:r>
-            <w:proofErr w:type="spellEnd"/>
-            <w:r>
-              <w:rPr>
-                <w:rFonts w:ascii="Calibri" w:eastAsia="Calibri" w:hAnsi="Calibri" w:cs="Calibri"/>
-                <w:color w:val="2C2C2C"/>
-              </w:rPr>
-              <w:t/>
+              <w:lastRenderedPageBreak/>
+              <w:t>• Created functional and technical documentation in Confluence, improving knowledge sharing and troubleshooting efficiency by 50%.</w:t>
             </w:r>
           </w:p>
           <w:p>
@@ -1082,139 +900,69 @@
                 <w:color w:val="344454"/>
                 <w:sz w:val="18"/>
               </w:rPr>
-              <w:t>C#, .NET, ASP.NET Core, EF Core, REST APIs, Azure (Key Vault, Application Insights, Redis, Blob Storage, Service Bus, Functions, AI Search), SQL Server, Retool, Polly, SonarQube, Cursor, MCP.</w:t>
+              <w:t>C#, .NET, AWS S3, AWS SQS, Buildkite CI/CD, Snyk, Clean Architecture, Confluence.</w:t>
             </w:r>
           </w:p>
           <w:p>
             <w:pPr>
               <w:keepNext/>
-              <w:pageBreakBefore/>
               <w:tabs>
                 <w:tab w:val="right" w:pos="8040"/>
               </w:tabs>
-              <w:spacing w:before="120" w:after="30"/>
-              <w:rPr>
-                <w:rFonts w:ascii="Calibri" w:eastAsia="Calibri" w:hAnsi="Calibri" w:cs="Calibri"/>
-                <w:b/>
-                <w:bCs/>
-                <w:i/>
-                <w:iCs/>
+              <w:spacing w:before="180" w:after="30"/>
+              <w:rPr>
+                <w:rFonts w:ascii="Calibri" w:eastAsia="Calibri" w:hAnsi="Calibri" w:cs="Calibri"/>
+                <w:b/>
+                <w:bCs/>
+                <w:color w:val="2C2C2C"/>
+                <w:sz w:val="24"/>
+                <w:szCs w:val="24"/>
+              </w:rPr>
+            </w:pPr>
+          </w:p>
+          <w:p>
+            <w:pPr>
+              <w:keepNext/>
+              <w:tabs>
+                <w:tab w:val="right" w:pos="8040"/>
+              </w:tabs>
+              <w:spacing w:before="180" w:after="30"/>
+            </w:pPr>
+            <w:r>
+              <w:rPr>
+                <w:rFonts w:ascii="Calibri" w:eastAsia="Calibri" w:hAnsi="Calibri" w:cs="Calibri"/>
+                <w:b/>
+                <w:bCs/>
+                <w:color w:val="2C2C2C"/>
+                <w:sz w:val="24"/>
+                <w:szCs w:val="24"/>
+              </w:rPr>
+              <w:t>Senior Engineer</w:t>
+            </w:r>
+            <w:r>
+              <w:rPr>
+                <w:rFonts w:ascii="Calibri" w:eastAsia="Calibri" w:hAnsi="Calibri" w:cs="Calibri"/>
+                <w:color w:val="6B7280"/>
+              </w:rPr>
+              <w:tab/>
+              <w:t>2011 – 2021</w:t>
+            </w:r>
+          </w:p>
+          <w:p>
+            <w:pPr>
+              <w:keepNext/>
+              <w:spacing w:after="100"/>
+            </w:pPr>
+            <w:r>
+              <w:rPr>
+                <w:rFonts w:ascii="Calibri" w:eastAsia="Calibri" w:hAnsi="Calibri" w:cs="Calibri"/>
+                <w:b/>
+                <w:bCs/>
                 <w:color w:val="1E7F76"/>
                 <w:sz w:val="22"/>
                 <w:szCs w:val="22"/>
               </w:rPr>
-            </w:pPr>
-          </w:p>
-          <w:p>
-            <w:pPr>
-              <w:keepNext/>
-              <w:pageBreakBefore/>
-              <w:tabs>
-                <w:tab w:val="right" w:pos="8040"/>
-              </w:tabs>
-              <w:spacing w:before="120" w:after="30"/>
-            </w:pPr>
-            <w:r>
-              <w:rPr>
-                <w:rFonts w:ascii="Calibri" w:eastAsia="Calibri" w:hAnsi="Calibri" w:cs="Calibri"/>
-                <w:b/>
-                <w:bCs/>
-                <w:i/>
-                <w:iCs/>
-                <w:color w:val="1E7F76"/>
-                <w:sz w:val="22"/>
-                <w:szCs w:val="22"/>
-              </w:rPr>
-              <w:t>.</w:t>
-            </w:r>
-            <w:r>
-              <w:rPr>
-                <w:rFonts w:ascii="Calibri" w:eastAsia="Calibri" w:hAnsi="Calibri" w:cs="Calibri"/>
-                <w:b/>
-                <w:bCs/>
-                <w:color w:val="24344A"/>
-                <w:sz w:val="24"/>
-                <w:szCs w:val="24"/>
-              </w:rPr>
-              <w:t>NET Developer</w:t>
-            </w:r>
-            <w:r>
-              <w:rPr>
-                <w:rFonts w:ascii="Calibri" w:eastAsia="Calibri" w:hAnsi="Calibri" w:cs="Calibri"/>
-                <w:color w:val="6B7280"/>
-              </w:rPr>
-              <w:tab/>
-              <w:t>2021 – 2023</w:t>
-            </w:r>
-          </w:p>
-          <w:p>
-            <w:pPr>
-              <w:keepNext/>
-              <w:spacing w:after="100"/>
-            </w:pPr>
-            <w:r>
-              <w:rPr>
-                <w:rFonts w:ascii="Calibri" w:eastAsia="Calibri" w:hAnsi="Calibri" w:cs="Calibri"/>
-                <w:b/>
-                <w:bCs/>
-                <w:color w:val="1E7F76"/>
-                <w:sz w:val="22"/>
-                <w:szCs w:val="22"/>
-              </w:rPr>
-              <w:t xml:space="preserve">Client: </w:t>
-            </w:r>
-            <w:proofErr w:type="spellStart"/>
-            <w:r>
-              <w:rPr>
-                <w:rFonts w:ascii="Calibri" w:eastAsia="Calibri" w:hAnsi="Calibri" w:cs="Calibri"/>
-                <w:b/>
-                <w:bCs/>
-                <w:color w:val="1E7F76"/>
-                <w:sz w:val="22"/>
-                <w:szCs w:val="22"/>
-              </w:rPr>
-              <w:t>Optimatech</w:t>
-            </w:r>
-            <w:proofErr w:type="spellEnd"/>
-            <w:r>
-              <w:rPr>
-                <w:rFonts w:ascii="Calibri" w:eastAsia="Calibri" w:hAnsi="Calibri" w:cs="Calibri"/>
-                <w:b/>
-                <w:bCs/>
-                <w:color w:val="1E7F76"/>
-                <w:sz w:val="22"/>
-                <w:szCs w:val="22"/>
-              </w:rPr>
-              <w:t xml:space="preserve"> AU @ </w:t>
-            </w:r>
-            <w:proofErr w:type="spellStart"/>
-            <w:r>
-              <w:rPr>
-                <w:rFonts w:ascii="Calibri" w:eastAsia="Calibri" w:hAnsi="Calibri" w:cs="Calibri"/>
-                <w:b/>
-                <w:bCs/>
-                <w:color w:val="1E7F76"/>
-                <w:sz w:val="22"/>
-                <w:szCs w:val="22"/>
-              </w:rPr>
-              <w:t>Emapta</w:t>
-            </w:r>
-            <w:proofErr w:type="spellEnd"/>
-            <w:r>
-              <w:rPr>
-                <w:rFonts w:ascii="Calibri" w:eastAsia="Calibri" w:hAnsi="Calibri" w:cs="Calibri"/>
-                <w:i/>
-                <w:iCs/>
-                <w:color w:val="6B7280"/>
-              </w:rPr>
-              <w:br/>
-            </w:r>
-            <w:r>
-              <w:rPr>
-                <w:rFonts w:ascii="Calibri" w:eastAsia="Calibri" w:hAnsi="Calibri" w:cs="Calibri"/>
-                <w:color w:val="1E7F76"/>
-              </w:rPr>
-              <w:t>https://optimatech.io</w:t>
+              <w:t>Renesas Semiconductor KL SDN BHD, Kuala Langat, Malaysia</w:t>
             </w:r>
           </w:p>
           <w:p>
@@ -1228,7 +976,7 @@
                 <w:rFonts w:ascii="Calibri" w:eastAsia="Calibri" w:hAnsi="Calibri" w:cs="Calibri"/>
                 <w:color w:val="2C2C2C"/>
               </w:rPr>
-              <w:t xml:space="preserve">• Built, maintained and refactored C# / .NET energy applications, using AWS S3 and SQS for scalable storage and reliable asynchronous messaging.</w:t>
+              <w:t>• Served as a senior engineer managing and scaling 24/7 Manufacturing Execution Systems (MES) and enterprise IT applications across 100+ production, VMware, and Hyper-V servers.</w:t>
             </w:r>
           </w:p>
           <w:p>
@@ -1242,7 +990,7 @@
                 <w:rFonts w:ascii="Calibri" w:eastAsia="Calibri" w:hAnsi="Calibri" w:cs="Calibri"/>
                 <w:color w:val="2C2C2C"/>
               </w:rPr>
-              <w:t xml:space="preserve">• Applied Clean Architecture, code reviews and Snyk security scanning; automated validation maintained 99% meter data accuracy.</w:t>
+              <w:t>• Engineered custom VB.NET, SQL Server, and Oracle solutions that boosted floor productivity by 75% and delivered &gt; MYR 1M in verified time-saving operational benefits.</w:t>
             </w:r>
           </w:p>
           <w:p>
@@ -1256,7 +1004,7 @@
                 <w:rFonts w:ascii="Calibri" w:eastAsia="Calibri" w:hAnsi="Calibri" w:cs="Calibri"/>
                 <w:color w:val="2C2C2C"/>
               </w:rPr>
-              <w:t xml:space="preserve">• Delivered releases across Test, UAT and Production using Buildkite CI/CD with minimal downtime.</w:t>
+              <w:t>• Architected the Electronic Lot Control Slip (e-LCS) and e-Counting Balance System, implementing poka-yoke validation to eliminate lot-mixing defects and save up to 800,000 scrapped component pieces.</w:t>
             </w:r>
           </w:p>
           <w:p>
@@ -1270,7 +1018,21 @@
                 <w:rFonts w:ascii="Calibri" w:eastAsia="Calibri" w:hAnsi="Calibri" w:cs="Calibri"/>
                 <w:color w:val="2C2C2C"/>
               </w:rPr>
-              <w:t xml:space="preserve">• Created functional and technical documentation in Confluence, improving knowledge sharing and troubleshooting efficiency by 50%.</w:t>
+              <w:t>• Integrated SAP with MES to fully automate material master registration and production planning runs, eliminating manual data entry cycles.</w:t>
+            </w:r>
+          </w:p>
+          <w:p>
+            <w:pPr>
+              <w:keepLines/>
+              <w:spacing w:after="70"/>
+              <w:ind w:left="280" w:hanging="200"/>
+            </w:pPr>
+            <w:r>
+              <w:rPr>
+                <w:rFonts w:ascii="Calibri" w:eastAsia="Calibri" w:hAnsi="Calibri" w:cs="Calibri"/>
+                <w:color w:val="2C2C2C"/>
+              </w:rPr>
+              <w:t>• Built internal RSKL Helpdesk ticketing system (VB.NET, ASP.NET, SQL Server) and real-time Spotfire manufacturing analytics dashboards for operational leadership.</w:t>
             </w:r>
           </w:p>
           <w:p>
@@ -1298,7 +1060,7 @@
                 <w:color w:val="344454"/>
                 <w:sz w:val="18"/>
               </w:rPr>
-              <w:t>C#, .NET, AWS S3, AWS SQS, Buildkite CI/CD, Snyk, Clean Architecture, Confluence.</w:t>
+              <w:t>VB.NET, ASP.NET, SQL Server, Oracle, SAP, MES, TIBCO Spotfire, VMware, Hyper-V.</w:t>
             </w:r>
           </w:p>
           <w:p>
@@ -1335,7 +1097,7 @@
                 <w:sz w:val="24"/>
                 <w:szCs w:val="24"/>
               </w:rPr>
-              <w:t>Senior Engineer</w:t>
+              <w:t>IT Manager / IT Executive</w:t>
             </w:r>
             <w:r>
               <w:rPr>
@@ -1343,7 +1105,7 @@
                 <w:color w:val="6B7280"/>
               </w:rPr>
               <w:tab/>
-              <w:t>2011 – 2021</w:t>
+              <w:t>2008 – 2010</w:t>
             </w:r>
           </w:p>
           <w:p>
@@ -1360,7 +1122,7 @@
                 <w:sz w:val="22"/>
                 <w:szCs w:val="22"/>
               </w:rPr>
-              <w:t>Renesas Semiconductor KL SDN BHD, Kuala Langat, Malaysia</w:t>
+              <w:t>Grand Dragon Resorts, Chrey Thom, Cambodia</w:t>
             </w:r>
           </w:p>
           <w:p>
@@ -1374,7 +1136,7 @@
                 <w:rFonts w:ascii="Calibri" w:eastAsia="Calibri" w:hAnsi="Calibri" w:cs="Calibri"/>
                 <w:color w:val="2C2C2C"/>
               </w:rPr>
-              <w:t xml:space="preserve">• Served as a senior engineer managing and scaling 24/7 Manufacturing Execution Systems (MES) and enterprise IT applications across 100+ production, VMware, and Hyper-V servers.</w:t>
+              <w:t>• As IT Manager: led end-to-end project planning, infrastructure deployments, documentation, and stakeholder management for resort systems.</w:t>
             </w:r>
           </w:p>
           <w:p>
@@ -1388,49 +1150,7 @@
                 <w:rFonts w:ascii="Calibri" w:eastAsia="Calibri" w:hAnsi="Calibri" w:cs="Calibri"/>
                 <w:color w:val="2C2C2C"/>
               </w:rPr>
-              <w:t xml:space="preserve">• Engineered custom VB.NET, SQL Server, and Oracle solutions that boosted floor productivity by 75% and delivered &gt; MYR 1M in verified time-saving operational benefits.</w:t>
-            </w:r>
-          </w:p>
-          <w:p>
-            <w:pPr>
-              <w:keepLines/>
-              <w:spacing w:after="70"/>
-              <w:ind w:left="280" w:hanging="200"/>
-            </w:pPr>
-            <w:r>
-              <w:rPr>
-                <w:rFonts w:ascii="Calibri" w:eastAsia="Calibri" w:hAnsi="Calibri" w:cs="Calibri"/>
-                <w:color w:val="2C2C2C"/>
-              </w:rPr>
-              <w:t xml:space="preserve">• Architected the Electronic Lot Control Slip (e-LCS) and e-Counting Balance System, implementing poka-yoke validation to eliminate lot-mixing defects and save up to 800,000 scrapped component pieces.</w:t>
-            </w:r>
-          </w:p>
-          <w:p>
-            <w:pPr>
-              <w:keepLines/>
-              <w:spacing w:after="70"/>
-              <w:ind w:left="280" w:hanging="200"/>
-            </w:pPr>
-            <w:r>
-              <w:rPr>
-                <w:rFonts w:ascii="Calibri" w:eastAsia="Calibri" w:hAnsi="Calibri" w:cs="Calibri"/>
-                <w:color w:val="2C2C2C"/>
-              </w:rPr>
-              <w:t xml:space="preserve">• Integrated SAP with MES to fully automate material master registration and production planning runs, eliminating manual data entry cycles.</w:t>
-            </w:r>
-          </w:p>
-          <w:p>
-            <w:pPr>
-              <w:keepLines/>
-              <w:spacing w:after="70"/>
-              <w:ind w:left="280" w:hanging="200"/>
-            </w:pPr>
-            <w:r>
-              <w:rPr>
-                <w:rFonts w:ascii="Calibri" w:eastAsia="Calibri" w:hAnsi="Calibri" w:cs="Calibri"/>
-                <w:color w:val="2C2C2C"/>
-              </w:rPr>
-              <w:t xml:space="preserve">• Built internal RSKL Helpdesk ticketing system (VB.NET, ASP.NET, SQL Server) and real-time Spotfire manufacturing analytics dashboards for operational leadership.</w:t>
+              <w:t>• As IT Executive: designed and delivered the Resort Operations System Suite — Point of Sale (POS), Casino Management System (CMS), and Biometric Timekeeping (ATS) using VB.NET and SQL Server.</w:t>
             </w:r>
           </w:p>
           <w:p>
@@ -1458,7 +1178,7 @@
                 <w:color w:val="344454"/>
                 <w:sz w:val="18"/>
               </w:rPr>
-              <w:t>VB.NET, ASP.NET, SQL Server, Oracle, SAP, MES, TIBCO Spotfire, VMware, Hyper-V.</w:t>
+              <w:t>VB.NET, PHP, SQL Server, POS, Casino Management System, biometric timekeeping.</w:t>
             </w:r>
           </w:p>
           <w:p>
@@ -1495,7 +1215,7 @@
                 <w:sz w:val="24"/>
                 <w:szCs w:val="24"/>
               </w:rPr>
-              <w:t>IT Manager / IT Executive</w:t>
+              <w:t>Senior Programmer / Junior Programmer</w:t>
             </w:r>
             <w:r>
               <w:rPr>
@@ -1503,7 +1223,7 @@
                 <w:color w:val="6B7280"/>
               </w:rPr>
               <w:tab/>
-              <w:t>2008 – 2010</w:t>
+              <w:t>2005 – 2008</w:t>
             </w:r>
           </w:p>
           <w:p>
@@ -1520,31 +1240,7 @@
                 <w:sz w:val="22"/>
                 <w:szCs w:val="22"/>
               </w:rPr>
-              <w:t xml:space="preserve">Grand Dragon Resorts, </w:t>
-            </w:r>
-            <w:proofErr w:type="spellStart"/>
-            <w:r>
-              <w:rPr>
-                <w:rFonts w:ascii="Calibri" w:eastAsia="Calibri" w:hAnsi="Calibri" w:cs="Calibri"/>
-                <w:b/>
-                <w:bCs/>
-                <w:color w:val="1E7F76"/>
-                <w:sz w:val="22"/>
-                <w:szCs w:val="22"/>
-              </w:rPr>
-              <w:t>Chrey</w:t>
-            </w:r>
-            <w:proofErr w:type="spellEnd"/>
-            <w:r>
-              <w:rPr>
-                <w:rFonts w:ascii="Calibri" w:eastAsia="Calibri" w:hAnsi="Calibri" w:cs="Calibri"/>
-                <w:b/>
-                <w:bCs/>
-                <w:color w:val="1E7F76"/>
-                <w:sz w:val="22"/>
-                <w:szCs w:val="22"/>
-              </w:rPr>
-              <w:t xml:space="preserve"> Thom, Cambodia</w:t>
+              <w:t>Subic Bay Yacht Club, Subic Bay Olongapo, Philippines</w:t>
             </w:r>
           </w:p>
           <w:p>
@@ -1558,7 +1254,7 @@
                 <w:rFonts w:ascii="Calibri" w:eastAsia="Calibri" w:hAnsi="Calibri" w:cs="Calibri"/>
                 <w:color w:val="2C2C2C"/>
               </w:rPr>
-              <w:t xml:space="preserve">• As IT Manager: led end-to-end project planning, infrastructure deployments, documentation, and stakeholder management for resort systems.</w:t>
+              <w:t>• Developed custom VB.NET and SQL Server applications for payroll, employee timekeeping, billing, collections, accounts payable, and POS.</w:t>
             </w:r>
           </w:p>
           <w:p>
@@ -1572,7 +1268,7 @@
                 <w:rFonts w:ascii="Calibri" w:eastAsia="Calibri" w:hAnsi="Calibri" w:cs="Calibri"/>
                 <w:color w:val="2C2C2C"/>
               </w:rPr>
-              <w:t xml:space="preserve">• As IT Executive: designed and delivered the Resort Operations System Suite — Point of Sale (POS), Casino Management System (CMS), and Biometric Timekeeping (ATS) using VB.NET and SQL Server.</w:t>
+              <w:t>• Administered multi-platform infrastructure including Windows Server, SCO UNIX, Novell NetWare, Oracle OPERA PMS, and Micros-Fidelio systems, maintaining 99% database uptime.</w:t>
             </w:r>
           </w:p>
           <w:p>
@@ -1600,156 +1296,6 @@
                 <w:color w:val="344454"/>
                 <w:sz w:val="18"/>
               </w:rPr>
-              <w:t>VB.NET, PHP, SQL Server, POS, Casino Management System, biometric timekeeping.</w:t>
-            </w:r>
-          </w:p>
-          <w:p>
-            <w:pPr>
-              <w:keepNext/>
-              <w:tabs>
-                <w:tab w:val="right" w:pos="8040"/>
-              </w:tabs>
-              <w:spacing w:before="180" w:after="30"/>
-              <w:rPr>
-                <w:rFonts w:ascii="Calibri" w:eastAsia="Calibri" w:hAnsi="Calibri" w:cs="Calibri"/>
-                <w:b/>
-                <w:bCs/>
-                <w:color w:val="2C2C2C"/>
-                <w:sz w:val="24"/>
-                <w:szCs w:val="24"/>
-              </w:rPr>
-            </w:pPr>
-          </w:p>
-          <w:p>
-            <w:pPr>
-              <w:keepNext/>
-              <w:tabs>
-                <w:tab w:val="right" w:pos="8040"/>
-              </w:tabs>
-              <w:spacing w:before="180" w:after="30"/>
-            </w:pPr>
-            <w:r>
-              <w:rPr>
-                <w:rFonts w:ascii="Calibri" w:eastAsia="Calibri" w:hAnsi="Calibri" w:cs="Calibri"/>
-                <w:b/>
-                <w:bCs/>
-                <w:color w:val="2C2C2C"/>
-                <w:sz w:val="24"/>
-                <w:szCs w:val="24"/>
-              </w:rPr>
-              <w:t>Senior Programmer / Junior Programmer</w:t>
-            </w:r>
-            <w:r>
-              <w:rPr>
-                <w:rFonts w:ascii="Calibri" w:eastAsia="Calibri" w:hAnsi="Calibri" w:cs="Calibri"/>
-                <w:color w:val="6B7280"/>
-              </w:rPr>
-              <w:tab/>
-              <w:t>2005 – 2008</w:t>
-            </w:r>
-          </w:p>
-          <w:p>
-            <w:pPr>
-              <w:keepNext/>
-              <w:spacing w:after="100"/>
-            </w:pPr>
-            <w:r>
-              <w:rPr>
-                <w:rFonts w:ascii="Calibri" w:eastAsia="Calibri" w:hAnsi="Calibri" w:cs="Calibri"/>
-                <w:b/>
-                <w:bCs/>
-                <w:color w:val="1E7F76"/>
-                <w:sz w:val="22"/>
-                <w:szCs w:val="22"/>
-              </w:rPr>
-              <w:t>Subic Bay Yacht Club, Subic Bay Olongapo, Philippines</w:t>
-            </w:r>
-          </w:p>
-          <w:p>
-            <w:pPr>
-              <w:keepLines/>
-              <w:spacing w:after="70"/>
-              <w:ind w:left="280" w:hanging="200"/>
-            </w:pPr>
-            <w:r>
-              <w:rPr>
-                <w:rFonts w:ascii="Calibri" w:eastAsia="Calibri" w:hAnsi="Calibri" w:cs="Calibri"/>
-                <w:color w:val="2C2C2C"/>
-              </w:rPr>
-              <w:t xml:space="preserve">• Developed custom VB.NET and SQL Server applications for payroll, employee timekeeping, billing, collections, accounts payable, and POS.</w:t>
-            </w:r>
-            <w:proofErr w:type="spellStart"/>
-            <w:r>
-              <w:rPr>
-                <w:rFonts w:ascii="Calibri" w:eastAsia="Calibri" w:hAnsi="Calibri" w:cs="Calibri"/>
-                <w:color w:val="2C2C2C"/>
-              </w:rPr>
-              <w:t/>
-            </w:r>
-            <w:proofErr w:type="spellEnd"/>
-            <w:r>
-              <w:rPr>
-                <w:rFonts w:ascii="Calibri" w:eastAsia="Calibri" w:hAnsi="Calibri" w:cs="Calibri"/>
-                <w:color w:val="2C2C2C"/>
-              </w:rPr>
-              <w:t xml:space="preserve"/>
-            </w:r>
-          </w:p>
-          <w:p>
-            <w:pPr>
-              <w:keepLines/>
-              <w:spacing w:after="70"/>
-              <w:ind w:left="280" w:hanging="200"/>
-            </w:pPr>
-            <w:r>
-              <w:rPr>
-                <w:rFonts w:ascii="Calibri" w:eastAsia="Calibri" w:hAnsi="Calibri" w:cs="Calibri"/>
-                <w:color w:val="2C2C2C"/>
-              </w:rPr>
-              <w:t xml:space="preserve">• Administered multi-platform infrastructure including Windows Server, SCO UNIX, Novell NetWare, Oracle OPERA PMS, and Micros-Fidelio systems, maintaining 99% database uptime.</w:t>
-            </w:r>
-            <w:proofErr w:type="spellStart"/>
-            <w:r>
-              <w:rPr>
-                <w:rFonts w:ascii="Calibri" w:eastAsia="Calibri" w:hAnsi="Calibri" w:cs="Calibri"/>
-                <w:color w:val="2C2C2C"/>
-              </w:rPr>
-              <w:t/>
-            </w:r>
-            <w:proofErr w:type="spellEnd"/>
-            <w:r>
-              <w:rPr>
-                <w:rFonts w:ascii="Calibri" w:eastAsia="Calibri" w:hAnsi="Calibri" w:cs="Calibri"/>
-                <w:color w:val="2C2C2C"/>
-              </w:rPr>
-              <w:t xml:space="preserve"/>
-            </w:r>
-          </w:p>
-          <w:p>
-            <w:pPr>
-              <w:keepLines/>
-              <w:pBdr>
-                <w:left w:val="single" w:sz="12" w:space="6" w:color="1E7F76"/>
-              </w:pBdr>
-              <w:shd w:val="clear" w:color="auto" w:fill="EFF6F5"/>
-              <w:spacing w:before="100" w:after="140" w:line="259" w:lineRule="auto"/>
-              <w:ind w:left="140" w:right="100"/>
-            </w:pPr>
-            <w:r>
-              <w:rPr>
-                <w:rFonts w:ascii="Calibri" w:hAnsi="Calibri"/>
-                <w:b/>
-                <w:color w:val="1E7F76"/>
-                <w:sz w:val="18"/>
-              </w:rPr>
-              <w:t xml:space="preserve">Technologies: </w:t>
-            </w:r>
-            <w:r>
-              <w:rPr>
-                <w:rFonts w:ascii="Calibri" w:hAnsi="Calibri"/>
-                <w:color w:val="344454"/>
-                <w:sz w:val="18"/>
-              </w:rPr>
               <w:t>VB.NET, SQL Server, Windows Server, SCO UNIX, Novell NetWare, Oracle OPERA PMS, Micros-Fidelio.</w:t>
             </w:r>
           </w:p>
@@ -1841,39 +1387,7 @@
                 <w:rFonts w:ascii="Calibri" w:eastAsia="Calibri" w:hAnsi="Calibri" w:cs="Calibri"/>
                 <w:color w:val="2C2C2C"/>
               </w:rPr>
-              <w:t xml:space="preserve">Two-time Champion in 'INTO PROGRAMMING' </w:t>
-            </w:r>
-            <w:proofErr w:type="spellStart"/>
-            <w:r>
-              <w:rPr>
-                <w:rFonts w:ascii="Calibri" w:eastAsia="Calibri" w:hAnsi="Calibri" w:cs="Calibri"/>
-                <w:color w:val="2C2C2C"/>
-              </w:rPr>
-              <w:t>Tagisan</w:t>
-            </w:r>
-            <w:proofErr w:type="spellEnd"/>
-            <w:r>
-              <w:rPr>
-                <w:rFonts w:ascii="Calibri" w:eastAsia="Calibri" w:hAnsi="Calibri" w:cs="Calibri"/>
-                <w:color w:val="2C2C2C"/>
-              </w:rPr>
-              <w:t xml:space="preserve"> ng </w:t>
-            </w:r>
-            <w:proofErr w:type="spellStart"/>
-            <w:r>
-              <w:rPr>
-                <w:rFonts w:ascii="Calibri" w:eastAsia="Calibri" w:hAnsi="Calibri" w:cs="Calibri"/>
-                <w:color w:val="2C2C2C"/>
-              </w:rPr>
-              <w:t>Talino</w:t>
-            </w:r>
-            <w:proofErr w:type="spellEnd"/>
-            <w:r>
-              <w:rPr>
-                <w:rFonts w:ascii="Calibri" w:eastAsia="Calibri" w:hAnsi="Calibri" w:cs="Calibri"/>
-                <w:color w:val="2C2C2C"/>
-              </w:rPr>
-              <w:t xml:space="preserve"> (Regional and National Level), Deans Lister and Honorable Mention and Programmer of the Year</w:t>
+              <w:t>Two-time Champion in 'INTO PROGRAMMING' Tagisan ng Talino (Regional and National Level), Deans Lister and Honorable Mention and Programmer of the Year</w:t>
             </w:r>
             <w:r>
               <w:rPr>

</xml_diff>